<commit_message>
Add JDateChooser + dashboard booking UI improvements
Add jcalendar (jcalendar-1.4.jar) and wire it into the NetBeans project. Replace free-text booking/session date fields with com.toedter.calendar.JDateChooser (txtBkDateTime, txtBmDate) and set yyyy-MM-dd format; default date choosers to today and validate via getDate(). Remove fragile free-text date/time parsing in places and instead obtain dates from the choosers; add parseTimeSlot helper for time-slot parsing. Improve dashboard recent bookings: change title/subtext, add tooltip/cursor, add mouse click handler to open Booking Management for the clicked row, and switch the SQL to show today's bookings with a fallback query that lists recent/upcoming sessions. Update nbproject/project.properties to reference jcalendar and add the jar; compiled class files updated accordingly.
</commit_message>
<xml_diff>
--- a/Driving_School_Booking_System_SRS_Document.docx
+++ b/Driving_School_Booking_System_SRS_Document.docx
@@ -82,13 +82,171 @@
         <mc:AlternateContent>
           <mc:Choice Requires="wps">
             <w:drawing>
-              <wp:anchor distT="0" distB="0" distL="114300" distR="114300" simplePos="0" relativeHeight="251659264" behindDoc="0" locked="0" layoutInCell="1" allowOverlap="1" wp14:anchorId="00965F6B" wp14:editId="30E89D64">
+              <wp:anchor distT="0" distB="0" distL="114300" distR="114300" simplePos="0" relativeHeight="251660288" behindDoc="0" locked="0" layoutInCell="1" allowOverlap="1" wp14:anchorId="3B594C1F" wp14:editId="149FB9F4">
                 <wp:simplePos x="0" y="0"/>
                 <wp:positionH relativeFrom="margin">
                   <wp:align>center</wp:align>
                 </wp:positionH>
                 <wp:positionV relativeFrom="paragraph">
-                  <wp:posOffset>795655</wp:posOffset>
+                  <wp:posOffset>6539230</wp:posOffset>
+                </wp:positionV>
+                <wp:extent cx="2962275" cy="409575"/>
+                <wp:effectExtent l="0" t="0" r="0" b="0"/>
+                <wp:wrapNone/>
+                <wp:docPr id="1342280928" name="Text Box 2"/>
+                <wp:cNvGraphicFramePr/>
+                <a:graphic xmlns:a="http://schemas.openxmlformats.org/drawingml/2006/main">
+                  <a:graphicData uri="http://schemas.microsoft.com/office/word/2010/wordprocessingShape">
+                    <wps:wsp>
+                      <wps:cNvSpPr txBox="1"/>
+                      <wps:spPr>
+                        <a:xfrm>
+                          <a:off x="0" y="0"/>
+                          <a:ext cx="2962275" cy="409575"/>
+                        </a:xfrm>
+                        <a:prstGeom prst="rect">
+                          <a:avLst/>
+                        </a:prstGeom>
+                        <a:noFill/>
+                        <a:ln w="6350">
+                          <a:noFill/>
+                        </a:ln>
+                      </wps:spPr>
+                      <wps:txbx>
+                        <w:txbxContent>
+                          <w:p>
+                            <w:pPr>
+                              <w:rPr>
+                                <w:sz w:val="36"/>
+                                <w:szCs w:val="36"/>
+                              </w:rPr>
+                            </w:pPr>
+                            <w:r>
+                              <w:rPr>
+                                <w:sz w:val="36"/>
+                                <w:szCs w:val="36"/>
+                              </w:rPr>
+                              <w:t xml:space="preserve">Chamika </w:t>
+                            </w:r>
+                            <w:proofErr w:type="spellStart"/>
+                            <w:r>
+                              <w:rPr>
+                                <w:sz w:val="36"/>
+                                <w:szCs w:val="36"/>
+                              </w:rPr>
+                              <w:t>Sandeepa</w:t>
+                            </w:r>
+                            <w:proofErr w:type="spellEnd"/>
+                            <w:r>
+                              <w:rPr>
+                                <w:sz w:val="36"/>
+                                <w:szCs w:val="36"/>
+                              </w:rPr>
+                              <w:t xml:space="preserve"> </w:t>
+                            </w:r>
+                            <w:proofErr w:type="spellStart"/>
+                            <w:r>
+                              <w:rPr>
+                                <w:sz w:val="36"/>
+                                <w:szCs w:val="36"/>
+                              </w:rPr>
+                              <w:t>Ranasinha</w:t>
+                            </w:r>
+                            <w:proofErr w:type="spellEnd"/>
+                          </w:p>
+                        </w:txbxContent>
+                      </wps:txbx>
+                      <wps:bodyPr rot="0" spcFirstLastPara="0" vertOverflow="overflow" horzOverflow="overflow" vert="horz" wrap="square" lIns="91440" tIns="45720" rIns="91440" bIns="45720" numCol="1" spcCol="0" rtlCol="0" fromWordArt="0" anchor="t" anchorCtr="0" forceAA="0" compatLnSpc="1">
+                        <a:prstTxWarp prst="textNoShape">
+                          <a:avLst/>
+                        </a:prstTxWarp>
+                        <a:noAutofit/>
+                      </wps:bodyPr>
+                    </wps:wsp>
+                  </a:graphicData>
+                </a:graphic>
+                <wp14:sizeRelH relativeFrom="margin">
+                  <wp14:pctWidth>0</wp14:pctWidth>
+                </wp14:sizeRelH>
+                <wp14:sizeRelV relativeFrom="margin">
+                  <wp14:pctHeight>0</wp14:pctHeight>
+                </wp14:sizeRelV>
+              </wp:anchor>
+            </w:drawing>
+          </mc:Choice>
+          <mc:Fallback>
+            <w:pict>
+              <v:shapetype w14:anchorId="3B594C1F" id="_x0000_t202" coordsize="21600,21600" o:spt="202" path="m,l,21600r21600,l21600,xe">
+                <v:stroke joinstyle="miter"/>
+                <v:path gradientshapeok="t" o:connecttype="rect"/>
+              </v:shapetype>
+              <v:shape id="Text Box 2" o:spid="_x0000_s1026" type="#_x0000_t202" style="position:absolute;margin-left:0;margin-top:514.9pt;width:233.25pt;height:32.25pt;z-index:251660288;visibility:visible;mso-wrap-style:square;mso-width-percent:0;mso-height-percent:0;mso-wrap-distance-left:9pt;mso-wrap-distance-top:0;mso-wrap-distance-right:9pt;mso-wrap-distance-bottom:0;mso-position-horizontal:center;mso-position-horizontal-relative:margin;mso-position-vertical:absolute;mso-position-vertical-relative:text;mso-width-percent:0;mso-height-percent:0;mso-width-relative:margin;mso-height-relative:margin;v-text-anchor:top" o:gfxdata="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" filled="f" stroked="f" strokeweight=".5pt">
+                <v:textbox>
+                  <w:txbxContent>
+                    <w:p>
+                      <w:pPr>
+                        <w:rPr>
+                          <w:sz w:val="36"/>
+                          <w:szCs w:val="36"/>
+                        </w:rPr>
+                      </w:pPr>
+                      <w:r>
+                        <w:rPr>
+                          <w:sz w:val="36"/>
+                          <w:szCs w:val="36"/>
+                        </w:rPr>
+                        <w:t xml:space="preserve">Chamika </w:t>
+                      </w:r>
+                      <w:proofErr w:type="spellStart"/>
+                      <w:r>
+                        <w:rPr>
+                          <w:sz w:val="36"/>
+                          <w:szCs w:val="36"/>
+                        </w:rPr>
+                        <w:t>Sandeepa</w:t>
+                      </w:r>
+                      <w:proofErr w:type="spellEnd"/>
+                      <w:r>
+                        <w:rPr>
+                          <w:sz w:val="36"/>
+                          <w:szCs w:val="36"/>
+                        </w:rPr>
+                        <w:t xml:space="preserve"> </w:t>
+                      </w:r>
+                      <w:proofErr w:type="spellStart"/>
+                      <w:r>
+                        <w:rPr>
+                          <w:sz w:val="36"/>
+                          <w:szCs w:val="36"/>
+                        </w:rPr>
+                        <w:t>Ranasinha</w:t>
+                      </w:r>
+                      <w:proofErr w:type="spellEnd"/>
+                    </w:p>
+                  </w:txbxContent>
+                </v:textbox>
+                <w10:wrap anchorx="margin"/>
+              </v:shape>
+            </w:pict>
+          </mc:Fallback>
+        </mc:AlternateContent>
+      </w:r>
+      <w:r>
+        <w:rPr>
+          <w:rFonts w:eastAsia="Times New Roman"/>
+          <w:noProof/>
+          <w:lang w:val="en"/>
+        </w:rPr>
+        <mc:AlternateContent>
+          <mc:Choice Requires="wps">
+            <w:drawing>
+              <wp:anchor distT="0" distB="0" distL="114300" distR="114300" simplePos="0" relativeHeight="251659264" behindDoc="0" locked="0" layoutInCell="1" allowOverlap="1" wp14:anchorId="00965F6B" wp14:editId="3AED50BF">
+                <wp:simplePos x="0" y="0"/>
+                <wp:positionH relativeFrom="margin">
+                  <wp:align>center</wp:align>
+                </wp:positionH>
+                <wp:positionV relativeFrom="paragraph">
+                  <wp:posOffset>1348105</wp:posOffset>
                 </wp:positionV>
                 <wp:extent cx="6915150" cy="2409825"/>
                 <wp:effectExtent l="0" t="0" r="0" b="0"/>
@@ -164,11 +322,7 @@
           </mc:Choice>
           <mc:Fallback>
             <w:pict>
-              <v:shapetype w14:anchorId="00965F6B" id="_x0000_t202" coordsize="21600,21600" o:spt="202" path="m,l,21600r21600,l21600,xe">
-                <v:stroke joinstyle="miter"/>
-                <v:path gradientshapeok="t" o:connecttype="rect"/>
-              </v:shapetype>
-              <v:shape id="Text Box 1" o:spid="_x0000_s1026" type="#_x0000_t202" style="position:absolute;margin-left:0;margin-top:62.65pt;width:544.5pt;height:189.75pt;z-index:251659264;visibility:visible;mso-wrap-style:square;mso-width-percent:0;mso-wrap-distance-left:9pt;mso-wrap-distance-top:0;mso-wrap-distance-right:9pt;mso-wrap-distance-bottom:0;mso-position-horizontal:center;mso-position-horizontal-relative:margin;mso-position-vertical:absolute;mso-position-vertical-relative:text;mso-width-percent:0;mso-width-relative:margin;v-text-anchor:top" o:gfxdata="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" filled="f" stroked="f" strokeweight=".5pt">
+              <v:shape w14:anchorId="00965F6B" id="Text Box 1" o:spid="_x0000_s1027" type="#_x0000_t202" style="position:absolute;margin-left:0;margin-top:106.15pt;width:544.5pt;height:189.75pt;z-index:251659264;visibility:visible;mso-wrap-style:square;mso-width-percent:0;mso-wrap-distance-left:9pt;mso-wrap-distance-top:0;mso-wrap-distance-right:9pt;mso-wrap-distance-bottom:0;mso-position-horizontal:center;mso-position-horizontal-relative:margin;mso-position-vertical:absolute;mso-position-vertical-relative:text;mso-width-percent:0;mso-width-relative:margin;v-text-anchor:top" o:gfxdata="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" filled="f" stroked="f" strokeweight=".5pt">
                 <v:textbox>
                   <w:txbxContent>
                     <w:p>
@@ -220,6 +374,12 @@
     </w:p>
     <w:sdt>
       <w:sdtPr>
+        <w:rPr>
+          <w:rFonts w:ascii="Times New Roman" w:eastAsiaTheme="minorEastAsia" w:hAnsi="Times New Roman" w:cs="Times New Roman"/>
+          <w:color w:val="auto"/>
+          <w:sz w:val="24"/>
+          <w:szCs w:val="24"/>
+        </w:rPr>
         <w:id w:val="-2124673008"/>
         <w:docPartObj>
           <w:docPartGallery w:val="Table of Contents"/>
@@ -228,13 +388,9 @@
       </w:sdtPr>
       <w:sdtEndPr>
         <w:rPr>
-          <w:rFonts w:ascii="Times New Roman" w:eastAsiaTheme="minorEastAsia" w:hAnsi="Times New Roman" w:cs="Times New Roman"/>
           <w:b/>
           <w:bCs/>
           <w:noProof/>
-          <w:color w:val="auto"/>
-          <w:sz w:val="24"/>
-          <w:szCs w:val="24"/>
         </w:rPr>
       </w:sdtEndPr>
       <w:sdtContent>
@@ -314,7 +470,7 @@
                 <w:noProof/>
                 <w:webHidden/>
               </w:rPr>
-              <w:t>3</w:t>
+              <w:t>4</w:t>
             </w:r>
             <w:r>
               <w:rPr>
@@ -384,7 +540,7 @@
                 <w:noProof/>
                 <w:webHidden/>
               </w:rPr>
-              <w:t>3</w:t>
+              <w:t>4</w:t>
             </w:r>
             <w:r>
               <w:rPr>
@@ -454,7 +610,7 @@
                 <w:noProof/>
                 <w:webHidden/>
               </w:rPr>
-              <w:t>3</w:t>
+              <w:t>4</w:t>
             </w:r>
             <w:r>
               <w:rPr>
@@ -524,7 +680,7 @@
                 <w:noProof/>
                 <w:webHidden/>
               </w:rPr>
-              <w:t>3</w:t>
+              <w:t>4</w:t>
             </w:r>
             <w:r>
               <w:rPr>
@@ -664,7 +820,7 @@
                 <w:noProof/>
                 <w:webHidden/>
               </w:rPr>
-              <w:t>4</w:t>
+              <w:t>5</w:t>
             </w:r>
             <w:r>
               <w:rPr>
@@ -944,7 +1100,7 @@
                 <w:noProof/>
                 <w:webHidden/>
               </w:rPr>
-              <w:t>5</w:t>
+              <w:t>6</w:t>
             </w:r>
             <w:r>
               <w:rPr>
@@ -1014,7 +1170,7 @@
                 <w:noProof/>
                 <w:webHidden/>
               </w:rPr>
-              <w:t>5</w:t>
+              <w:t>6</w:t>
             </w:r>
             <w:r>
               <w:rPr>
@@ -1714,7 +1870,7 @@
                 <w:noProof/>
                 <w:webHidden/>
               </w:rPr>
-              <w:t>9</w:t>
+              <w:t>8</w:t>
             </w:r>
             <w:r>
               <w:rPr>
@@ -1924,7 +2080,7 @@
                 <w:noProof/>
                 <w:webHidden/>
               </w:rPr>
-              <w:t>10</w:t>
+              <w:t>9</w:t>
             </w:r>
             <w:r>
               <w:rPr>
@@ -1994,7 +2150,7 @@
                 <w:noProof/>
                 <w:webHidden/>
               </w:rPr>
-              <w:t>10</w:t>
+              <w:t>9</w:t>
             </w:r>
             <w:r>
               <w:rPr>
@@ -2223,7 +2379,7 @@
                 <w:noProof/>
                 <w:webHidden/>
               </w:rPr>
-              <w:t>11</w:t>
+              <w:t>10</w:t>
             </w:r>
             <w:r>
               <w:rPr>
@@ -2312,7 +2468,7 @@
                 <w:noProof/>
                 <w:webHidden/>
               </w:rPr>
-              <w:t>11</w:t>
+              <w:t>10</w:t>
             </w:r>
             <w:r>
               <w:rPr>
@@ -2401,7 +2557,7 @@
                 <w:noProof/>
                 <w:webHidden/>
               </w:rPr>
-              <w:t>12</w:t>
+              <w:t>11</w:t>
             </w:r>
             <w:r>
               <w:rPr>
@@ -2490,7 +2646,7 @@
                 <w:noProof/>
                 <w:webHidden/>
               </w:rPr>
-              <w:t>13</w:t>
+              <w:t>12</w:t>
             </w:r>
             <w:r>
               <w:rPr>
@@ -2579,7 +2735,7 @@
                 <w:noProof/>
                 <w:webHidden/>
               </w:rPr>
-              <w:t>14</w:t>
+              <w:t>12</w:t>
             </w:r>
             <w:r>
               <w:rPr>
@@ -2668,7 +2824,7 @@
                 <w:noProof/>
                 <w:webHidden/>
               </w:rPr>
-              <w:t>15</w:t>
+              <w:t>13</w:t>
             </w:r>
             <w:r>
               <w:rPr>
@@ -2738,7 +2894,7 @@
                 <w:noProof/>
                 <w:webHidden/>
               </w:rPr>
-              <w:t>16</w:t>
+              <w:t>14</w:t>
             </w:r>
             <w:r>
               <w:rPr>
@@ -2808,7 +2964,7 @@
                 <w:noProof/>
                 <w:webHidden/>
               </w:rPr>
-              <w:t>17</w:t>
+              <w:t>14</w:t>
             </w:r>
             <w:r>
               <w:rPr>
@@ -2878,7 +3034,7 @@
                 <w:noProof/>
                 <w:webHidden/>
               </w:rPr>
-              <w:t>17</w:t>
+              <w:t>15</w:t>
             </w:r>
             <w:r>
               <w:rPr>
@@ -2948,7 +3104,7 @@
                 <w:noProof/>
                 <w:webHidden/>
               </w:rPr>
-              <w:t>17</w:t>
+              <w:t>15</w:t>
             </w:r>
             <w:r>
               <w:rPr>
@@ -3018,7 +3174,7 @@
                 <w:noProof/>
                 <w:webHidden/>
               </w:rPr>
-              <w:t>18</w:t>
+              <w:t>15</w:t>
             </w:r>
             <w:r>
               <w:rPr>
@@ -3088,7 +3244,7 @@
                 <w:noProof/>
                 <w:webHidden/>
               </w:rPr>
-              <w:t>19</w:t>
+              <w:t>16</w:t>
             </w:r>
             <w:r>
               <w:rPr>
@@ -3158,7 +3314,7 @@
                 <w:noProof/>
                 <w:webHidden/>
               </w:rPr>
-              <w:t>20</w:t>
+              <w:t>17</w:t>
             </w:r>
             <w:r>
               <w:rPr>
@@ -3228,7 +3384,7 @@
                 <w:noProof/>
                 <w:webHidden/>
               </w:rPr>
-              <w:t>21</w:t>
+              <w:t>17</w:t>
             </w:r>
             <w:r>
               <w:rPr>
@@ -3298,7 +3454,7 @@
                 <w:noProof/>
                 <w:webHidden/>
               </w:rPr>
-              <w:t>21</w:t>
+              <w:t>18</w:t>
             </w:r>
             <w:r>
               <w:rPr>
@@ -3368,7 +3524,7 @@
                 <w:noProof/>
                 <w:webHidden/>
               </w:rPr>
-              <w:t>22</w:t>
+              <w:t>18</w:t>
             </w:r>
             <w:r>
               <w:rPr>
@@ -3438,7 +3594,7 @@
                 <w:noProof/>
                 <w:webHidden/>
               </w:rPr>
-              <w:t>23</w:t>
+              <w:t>19</w:t>
             </w:r>
             <w:r>
               <w:rPr>
@@ -3508,7 +3664,7 @@
                 <w:noProof/>
                 <w:webHidden/>
               </w:rPr>
-              <w:t>24</w:t>
+              <w:t>19</w:t>
             </w:r>
             <w:r>
               <w:rPr>
@@ -3578,7 +3734,7 @@
                 <w:noProof/>
                 <w:webHidden/>
               </w:rPr>
-              <w:t>24</w:t>
+              <w:t>19</w:t>
             </w:r>
             <w:r>
               <w:rPr>
@@ -3648,7 +3804,7 @@
                 <w:noProof/>
                 <w:webHidden/>
               </w:rPr>
-              <w:t>24</w:t>
+              <w:t>20</w:t>
             </w:r>
             <w:r>
               <w:rPr>
@@ -3718,7 +3874,7 @@
                 <w:noProof/>
                 <w:webHidden/>
               </w:rPr>
-              <w:t>25</w:t>
+              <w:t>20</w:t>
             </w:r>
             <w:r>
               <w:rPr>
@@ -3788,7 +3944,7 @@
                 <w:noProof/>
                 <w:webHidden/>
               </w:rPr>
-              <w:t>25</w:t>
+              <w:t>20</w:t>
             </w:r>
             <w:r>
               <w:rPr>
@@ -3858,7 +4014,7 @@
                 <w:noProof/>
                 <w:webHidden/>
               </w:rPr>
-              <w:t>25</w:t>
+              <w:t>21</w:t>
             </w:r>
             <w:r>
               <w:rPr>
@@ -3928,7 +4084,7 @@
                 <w:noProof/>
                 <w:webHidden/>
               </w:rPr>
-              <w:t>25</w:t>
+              <w:t>21</w:t>
             </w:r>
             <w:r>
               <w:rPr>
@@ -3998,7 +4154,7 @@
                 <w:noProof/>
                 <w:webHidden/>
               </w:rPr>
-              <w:t>26</w:t>
+              <w:t>21</w:t>
             </w:r>
             <w:r>
               <w:rPr>
@@ -4068,7 +4224,7 @@
                 <w:noProof/>
                 <w:webHidden/>
               </w:rPr>
-              <w:t>26</w:t>
+              <w:t>21</w:t>
             </w:r>
             <w:r>
               <w:rPr>
@@ -4138,7 +4294,7 @@
                 <w:noProof/>
                 <w:webHidden/>
               </w:rPr>
-              <w:t>26</w:t>
+              <w:t>21</w:t>
             </w:r>
             <w:r>
               <w:rPr>
@@ -4208,7 +4364,7 @@
                 <w:noProof/>
                 <w:webHidden/>
               </w:rPr>
-              <w:t>27</w:t>
+              <w:t>22</w:t>
             </w:r>
             <w:r>
               <w:rPr>
@@ -4278,7 +4434,7 @@
                 <w:noProof/>
                 <w:webHidden/>
               </w:rPr>
-              <w:t>27</w:t>
+              <w:t>22</w:t>
             </w:r>
             <w:r>
               <w:rPr>
@@ -4348,7 +4504,7 @@
                 <w:noProof/>
                 <w:webHidden/>
               </w:rPr>
-              <w:t>27</w:t>
+              <w:t>22</w:t>
             </w:r>
             <w:r>
               <w:rPr>
@@ -4418,7 +4574,7 @@
                 <w:noProof/>
                 <w:webHidden/>
               </w:rPr>
-              <w:t>27</w:t>
+              <w:t>22</w:t>
             </w:r>
             <w:r>
               <w:rPr>
@@ -4488,7 +4644,7 @@
                 <w:noProof/>
                 <w:webHidden/>
               </w:rPr>
-              <w:t>28</w:t>
+              <w:t>23</w:t>
             </w:r>
             <w:r>
               <w:rPr>
@@ -4558,7 +4714,7 @@
                 <w:noProof/>
                 <w:webHidden/>
               </w:rPr>
-              <w:t>28</w:t>
+              <w:t>23</w:t>
             </w:r>
             <w:r>
               <w:rPr>
@@ -4628,7 +4784,7 @@
                 <w:noProof/>
                 <w:webHidden/>
               </w:rPr>
-              <w:t>28</w:t>
+              <w:t>23</w:t>
             </w:r>
             <w:r>
               <w:rPr>
@@ -4717,7 +4873,7 @@
                 <w:noProof/>
                 <w:webHidden/>
               </w:rPr>
-              <w:t>28</w:t>
+              <w:t>23</w:t>
             </w:r>
             <w:r>
               <w:rPr>
@@ -4787,7 +4943,7 @@
                 <w:noProof/>
                 <w:webHidden/>
               </w:rPr>
-              <w:t>29</w:t>
+              <w:t>23</w:t>
             </w:r>
             <w:r>
               <w:rPr>
@@ -4857,7 +5013,7 @@
                 <w:noProof/>
                 <w:webHidden/>
               </w:rPr>
-              <w:t>29</w:t>
+              <w:t>23</w:t>
             </w:r>
             <w:r>
               <w:rPr>
@@ -4927,7 +5083,7 @@
                 <w:noProof/>
                 <w:webHidden/>
               </w:rPr>
-              <w:t>30</w:t>
+              <w:t>24</w:t>
             </w:r>
             <w:r>
               <w:rPr>
@@ -5285,29 +5441,7 @@
           <w:szCs w:val="22"/>
           <w:lang w:val="en"/>
         </w:rPr>
-        <w:t>: Absolute mandatory operational requirements. Non-</w:t>
-      </w:r>
-      <w:proofErr w:type="gramStart"/>
-      <w:r>
-        <w:rPr>
-          <w:rFonts w:ascii="Calibri" w:eastAsia="Times New Roman" w:hAnsi="Calibri" w:cs="Calibri"/>
-          <w:color w:val="1E293B"/>
-          <w:sz w:val="22"/>
-          <w:szCs w:val="22"/>
-          <w:lang w:val="en"/>
-        </w:rPr>
-        <w:t>negotiable for</w:t>
-      </w:r>
-      <w:proofErr w:type="gramEnd"/>
-      <w:r>
-        <w:rPr>
-          <w:rFonts w:ascii="Calibri" w:eastAsia="Times New Roman" w:hAnsi="Calibri" w:cs="Calibri"/>
-          <w:color w:val="1E293B"/>
-          <w:sz w:val="22"/>
-          <w:szCs w:val="22"/>
-          <w:lang w:val="en"/>
-        </w:rPr>
-        <w:t xml:space="preserve"> system deployment.</w:t>
+        <w:t>: Absolute mandatory operational requirements. Non-negotiable for system deployment.</w:t>
       </w:r>
     </w:p>
     <w:p>
@@ -5415,55 +5549,30 @@
         <w:t xml:space="preserve"> Database tables, column identifiers, classes, and SQL statements are represented in monospaced font (e.g., </w:t>
       </w:r>
       <w:proofErr w:type="spellStart"/>
-      <w:proofErr w:type="gramStart"/>
       <w:r>
         <w:rPr>
           <w:rStyle w:val="HTMLCode"/>
           <w:lang w:val="en"/>
         </w:rPr>
-        <w:t>users.first</w:t>
-      </w:r>
-      <w:proofErr w:type="gramEnd"/>
+        <w:t>users.first_time</w:t>
+      </w:r>
+      <w:proofErr w:type="spellEnd"/>
+      <w:r>
+        <w:rPr>
+          <w:rFonts w:ascii="Calibri" w:eastAsia="Times New Roman" w:hAnsi="Calibri" w:cs="Calibri"/>
+          <w:color w:val="1E293B"/>
+          <w:sz w:val="22"/>
+          <w:szCs w:val="22"/>
+          <w:lang w:val="en"/>
+        </w:rPr>
+        <w:t xml:space="preserve">, </w:t>
+      </w:r>
       <w:r>
         <w:rPr>
           <w:rStyle w:val="HTMLCode"/>
           <w:lang w:val="en"/>
         </w:rPr>
-        <w:t>_time</w:t>
-      </w:r>
-      <w:proofErr w:type="spellEnd"/>
-      <w:r>
-        <w:rPr>
-          <w:rFonts w:ascii="Calibri" w:eastAsia="Times New Roman" w:hAnsi="Calibri" w:cs="Calibri"/>
-          <w:color w:val="1E293B"/>
-          <w:sz w:val="22"/>
-          <w:szCs w:val="22"/>
-          <w:lang w:val="en"/>
-        </w:rPr>
-        <w:t xml:space="preserve">, </w:t>
-      </w:r>
-      <w:r>
-        <w:rPr>
-          <w:rStyle w:val="HTMLCode"/>
-          <w:lang w:val="en"/>
-        </w:rPr>
-        <w:t xml:space="preserve">SELECT </w:t>
-      </w:r>
-      <w:proofErr w:type="gramStart"/>
-      <w:r>
-        <w:rPr>
-          <w:rStyle w:val="HTMLCode"/>
-          <w:lang w:val="en"/>
-        </w:rPr>
-        <w:t>COUNT(</w:t>
-      </w:r>
-      <w:proofErr w:type="gramEnd"/>
-      <w:r>
-        <w:rPr>
-          <w:rStyle w:val="HTMLCode"/>
-          <w:lang w:val="en"/>
-        </w:rPr>
-        <w:t>*)</w:t>
+        <w:t>SELECT COUNT(*)</w:t>
       </w:r>
       <w:r>
         <w:rPr>
@@ -5641,7 +5750,6 @@
           <w:rFonts w:eastAsia="Times New Roman"/>
           <w:lang w:val="en"/>
         </w:rPr>
-        <w:lastRenderedPageBreak/>
         <w:t>1.4 Project Background &amp; Problem Statement</w:t>
       </w:r>
       <w:bookmarkEnd w:id="4"/>
@@ -5840,6 +5948,7 @@
           <w:szCs w:val="20"/>
           <w:lang w:val="en"/>
         </w:rPr>
+        <w:lastRenderedPageBreak/>
         <w:t>The Engineered Solution</w:t>
       </w:r>
     </w:p>
@@ -6110,73 +6219,7 @@
           <w:szCs w:val="22"/>
           <w:lang w:val="en"/>
         </w:rPr>
-        <w:t xml:space="preserve"> Automated multi-resource time-slot conflict checking ensuring strict collision-free scheduling across </w:t>
-      </w:r>
-      <w:proofErr w:type="gramStart"/>
-      <w:r>
-        <w:rPr>
-          <w:rFonts w:ascii="Calibri" w:eastAsia="Times New Roman" w:hAnsi="Calibri" w:cs="Calibri"/>
-          <w:color w:val="1E293B"/>
-          <w:sz w:val="22"/>
-          <w:szCs w:val="22"/>
-          <w:lang w:val="en"/>
-        </w:rPr>
-        <w:t>student</w:t>
-      </w:r>
-      <w:proofErr w:type="gramEnd"/>
-      <w:r>
-        <w:rPr>
-          <w:rFonts w:ascii="Calibri" w:eastAsia="Times New Roman" w:hAnsi="Calibri" w:cs="Calibri"/>
-          <w:color w:val="1E293B"/>
-          <w:sz w:val="22"/>
-          <w:szCs w:val="22"/>
-          <w:lang w:val="en"/>
-        </w:rPr>
-        <w:t xml:space="preserve">, </w:t>
-      </w:r>
-      <w:proofErr w:type="gramStart"/>
-      <w:r>
-        <w:rPr>
-          <w:rFonts w:ascii="Calibri" w:eastAsia="Times New Roman" w:hAnsi="Calibri" w:cs="Calibri"/>
-          <w:color w:val="1E293B"/>
-          <w:sz w:val="22"/>
-          <w:szCs w:val="22"/>
-          <w:lang w:val="en"/>
-        </w:rPr>
-        <w:t>instructor</w:t>
-      </w:r>
-      <w:proofErr w:type="gramEnd"/>
-      <w:r>
-        <w:rPr>
-          <w:rFonts w:ascii="Calibri" w:eastAsia="Times New Roman" w:hAnsi="Calibri" w:cs="Calibri"/>
-          <w:color w:val="1E293B"/>
-          <w:sz w:val="22"/>
-          <w:szCs w:val="22"/>
-          <w:lang w:val="en"/>
-        </w:rPr>
-        <w:t xml:space="preserve">, and </w:t>
-      </w:r>
-      <w:proofErr w:type="gramStart"/>
-      <w:r>
-        <w:rPr>
-          <w:rFonts w:ascii="Calibri" w:eastAsia="Times New Roman" w:hAnsi="Calibri" w:cs="Calibri"/>
-          <w:color w:val="1E293B"/>
-          <w:sz w:val="22"/>
-          <w:szCs w:val="22"/>
-          <w:lang w:val="en"/>
-        </w:rPr>
-        <w:t>vehicle</w:t>
-      </w:r>
-      <w:proofErr w:type="gramEnd"/>
-      <w:r>
-        <w:rPr>
-          <w:rFonts w:ascii="Calibri" w:eastAsia="Times New Roman" w:hAnsi="Calibri" w:cs="Calibri"/>
-          <w:color w:val="1E293B"/>
-          <w:sz w:val="22"/>
-          <w:szCs w:val="22"/>
-          <w:lang w:val="en"/>
-        </w:rPr>
-        <w:t>.</w:t>
+        <w:t xml:space="preserve"> Automated multi-resource time-slot conflict checking ensuring strict collision-free scheduling across student, instructor, and vehicle.</w:t>
       </w:r>
     </w:p>
     <w:p>
@@ -6230,7 +6273,6 @@
           <w:rFonts w:eastAsia="Times New Roman"/>
           <w:lang w:val="en"/>
         </w:rPr>
-        <w:lastRenderedPageBreak/>
         <w:t>1.6 Applicable Standards &amp; Industry References</w:t>
       </w:r>
       <w:bookmarkEnd w:id="6"/>
@@ -6597,6 +6639,7 @@
           <w:szCs w:val="22"/>
           <w:lang w:val="en"/>
         </w:rPr>
+        <w:lastRenderedPageBreak/>
         <w:t>Quality Assurance &amp; Verification Rigor:</w:t>
       </w:r>
       <w:r>
@@ -6682,7 +6725,6 @@
           <w:rFonts w:eastAsia="Times New Roman"/>
           <w:lang w:val="en"/>
         </w:rPr>
-        <w:lastRenderedPageBreak/>
         <w:t>Phase 2: Architectural &amp; Detailed System Design</w:t>
       </w:r>
       <w:bookmarkEnd w:id="11"/>
@@ -6727,33 +6769,14 @@
           <w:szCs w:val="22"/>
           <w:lang w:val="en"/>
         </w:rPr>
-        <w:t xml:space="preserve"> (Presentation, Business Logic, and Data Access). Detailed database schemas with strict primary and foreign key constraints were designed. Wireframes and UI interaction states (including dynamic button visibility rules: hide on load, reveal on table row selection) were designed in NetBeans GUI Builder </w:t>
-      </w:r>
-      <w:proofErr w:type="gramStart"/>
-      <w:r>
-        <w:rPr>
-          <w:rFonts w:ascii="Calibri" w:hAnsi="Calibri" w:cs="Calibri"/>
-          <w:color w:val="1E293B"/>
-          <w:sz w:val="22"/>
-          <w:szCs w:val="22"/>
-          <w:lang w:val="en"/>
-        </w:rPr>
-        <w:t>XML (</w:t>
+        <w:t xml:space="preserve"> (Presentation, Business Logic, and Data Access). Detailed database schemas with strict primary and foreign key constraints were designed. Wireframes and UI interaction states (including dynamic button visibility rules: hide on load, reveal on table row selection) were designed in NetBeans GUI Builder XML (</w:t>
       </w:r>
       <w:r>
         <w:rPr>
           <w:rStyle w:val="HTMLCode"/>
           <w:lang w:val="en"/>
         </w:rPr>
-        <w:t>.</w:t>
-      </w:r>
-      <w:proofErr w:type="gramEnd"/>
-      <w:r>
-        <w:rPr>
-          <w:rStyle w:val="HTMLCode"/>
-          <w:lang w:val="en"/>
-        </w:rPr>
-        <w:t>form</w:t>
+        <w:t>.form</w:t>
       </w:r>
       <w:r>
         <w:rPr>
@@ -6843,32 +6866,14 @@
         <w:t xml:space="preserve"> Top-level imports only (eliminating inline package namespaces), strict exception logging via </w:t>
       </w:r>
       <w:proofErr w:type="spellStart"/>
-      <w:proofErr w:type="gramStart"/>
       <w:r>
         <w:rPr>
           <w:rStyle w:val="HTMLCode"/>
           <w:lang w:val="en"/>
         </w:rPr>
-        <w:t>java.util</w:t>
-      </w:r>
-      <w:proofErr w:type="gramEnd"/>
-      <w:r>
-        <w:rPr>
-          <w:rStyle w:val="HTMLCode"/>
-          <w:lang w:val="en"/>
-        </w:rPr>
-        <w:t>.</w:t>
-      </w:r>
-      <w:proofErr w:type="gramStart"/>
-      <w:r>
-        <w:rPr>
-          <w:rStyle w:val="HTMLCode"/>
-          <w:lang w:val="en"/>
-        </w:rPr>
-        <w:t>logging.Logger</w:t>
+        <w:t>java.util.logging.Logger</w:t>
       </w:r>
       <w:proofErr w:type="spellEnd"/>
-      <w:proofErr w:type="gramEnd"/>
       <w:r>
         <w:rPr>
           <w:rFonts w:ascii="Calibri" w:eastAsia="Times New Roman" w:hAnsi="Calibri" w:cs="Calibri"/>
@@ -7292,7 +7297,6 @@
         </w:rPr>
         <w:t>The software was packaged into a standalone executable JAR archive (</w:t>
       </w:r>
-      <w:proofErr w:type="gramStart"/>
       <w:r>
         <w:rPr>
           <w:rStyle w:val="HTMLCode"/>
@@ -7300,7 +7304,6 @@
         </w:rPr>
         <w:t>driveingSchool.jar</w:t>
       </w:r>
-      <w:proofErr w:type="gramEnd"/>
       <w:r>
         <w:rPr>
           <w:rFonts w:ascii="Calibri" w:hAnsi="Calibri" w:cs="Calibri"/>
@@ -7410,6 +7413,7 @@
           <w:szCs w:val="22"/>
           <w:lang w:val="en"/>
         </w:rPr>
+        <w:lastRenderedPageBreak/>
         <w:t>Corrective Maintenance:</w:t>
       </w:r>
       <w:r>
@@ -7447,7 +7451,6 @@
           <w:szCs w:val="22"/>
           <w:lang w:val="en"/>
         </w:rPr>
-        <w:lastRenderedPageBreak/>
         <w:t>Adaptive Maintenance:</w:t>
       </w:r>
       <w:r>
@@ -7528,11 +7531,11 @@
         <w:tblLook w:val="04A0" w:firstRow="1" w:lastRow="0" w:firstColumn="1" w:lastColumn="0" w:noHBand="0" w:noVBand="1"/>
       </w:tblPr>
       <w:tblGrid>
-        <w:gridCol w:w="1431"/>
-        <w:gridCol w:w="1764"/>
-        <w:gridCol w:w="2324"/>
-        <w:gridCol w:w="2248"/>
-        <w:gridCol w:w="1577"/>
+        <w:gridCol w:w="1463"/>
+        <w:gridCol w:w="2090"/>
+        <w:gridCol w:w="2717"/>
+        <w:gridCol w:w="2299"/>
+        <w:gridCol w:w="1881"/>
       </w:tblGrid>
       <w:tr>
         <w:trPr>
@@ -8330,30 +8333,13 @@
                 <w:sz w:val="19"/>
                 <w:szCs w:val="19"/>
               </w:rPr>
-              <w:t xml:space="preserve">Compiled Source </w:t>
-            </w:r>
-            <w:proofErr w:type="gramStart"/>
-            <w:r>
-              <w:rPr>
-                <w:rFonts w:ascii="Calibri" w:eastAsia="Times New Roman" w:hAnsi="Calibri" w:cs="Calibri"/>
-                <w:color w:val="1E293B"/>
-                <w:sz w:val="19"/>
-                <w:szCs w:val="19"/>
-              </w:rPr>
-              <w:t>Code (</w:t>
+              <w:t>Compiled Source Code (</w:t>
             </w:r>
             <w:r>
               <w:rPr>
                 <w:rStyle w:val="HTMLCode"/>
               </w:rPr>
-              <w:t>.</w:t>
-            </w:r>
-            <w:proofErr w:type="gramEnd"/>
-            <w:r>
-              <w:rPr>
-                <w:rStyle w:val="HTMLCode"/>
-              </w:rPr>
-              <w:t>java</w:t>
+              <w:t>.java</w:t>
             </w:r>
             <w:r>
               <w:rPr>
@@ -8857,7 +8843,6 @@
                 <w:sz w:val="19"/>
                 <w:szCs w:val="19"/>
               </w:rPr>
-              <w:lastRenderedPageBreak/>
               <w:t>Phase 6: Maintenance</w:t>
             </w:r>
           </w:p>
@@ -9030,6 +9015,7 @@
           <w:rFonts w:eastAsia="Times New Roman"/>
           <w:lang w:val="en"/>
         </w:rPr>
+        <w:lastRenderedPageBreak/>
         <w:t>3. Overall System Description</w:t>
       </w:r>
       <w:bookmarkEnd w:id="17"/>
@@ -9337,7 +9323,6 @@
           <w:rFonts w:eastAsia="Times New Roman"/>
           <w:lang w:val="en"/>
         </w:rPr>
-        <w:lastRenderedPageBreak/>
         <w:t>3.3 User Classes, Personas &amp; Operational Responsibilities</w:t>
       </w:r>
       <w:bookmarkEnd w:id="20"/>
@@ -9354,10 +9339,10 @@
         <w:tblLook w:val="04A0" w:firstRow="1" w:lastRow="0" w:firstColumn="1" w:lastColumn="0" w:noHBand="0" w:noVBand="1"/>
       </w:tblPr>
       <w:tblGrid>
-        <w:gridCol w:w="1682"/>
-        <w:gridCol w:w="2056"/>
-        <w:gridCol w:w="2990"/>
-        <w:gridCol w:w="2616"/>
+        <w:gridCol w:w="1881"/>
+        <w:gridCol w:w="2299"/>
+        <w:gridCol w:w="3344"/>
+        <w:gridCol w:w="2926"/>
       </w:tblGrid>
       <w:tr>
         <w:trPr>
@@ -9958,44 +9943,55 @@
                 <w:sz w:val="19"/>
                 <w:szCs w:val="19"/>
               </w:rPr>
-              <w:t>Indirect user. Profile, license credentials, and duty availability (Available, On Duty, Leave, Inactive) are managed by Staff and Admin. Scheduled for practical sessions.</w:t>
-            </w:r>
-          </w:p>
-        </w:tc>
-        <w:tc>
-          <w:tcPr>
-            <w:tcW w:w="0" w:type="auto"/>
-            <w:tcBorders>
-              <w:top w:val="single" w:sz="6" w:space="0" w:color="CBD5E1"/>
-              <w:left w:val="single" w:sz="6" w:space="0" w:color="CBD5E1"/>
-              <w:bottom w:val="single" w:sz="6" w:space="0" w:color="CBD5E1"/>
-              <w:right w:val="single" w:sz="6" w:space="0" w:color="CBD5E1"/>
-            </w:tcBorders>
-            <w:tcMar>
-              <w:top w:w="120" w:type="dxa"/>
-              <w:left w:w="160" w:type="dxa"/>
-              <w:bottom w:w="120" w:type="dxa"/>
-              <w:right w:w="160" w:type="dxa"/>
-            </w:tcMar>
-            <w:hideMark/>
-          </w:tcPr>
-          <w:p>
-            <w:pPr>
-              <w:spacing w:before="200" w:after="280"/>
-              <w:rPr>
-                <w:rFonts w:ascii="Calibri" w:eastAsia="Times New Roman" w:hAnsi="Calibri" w:cs="Calibri"/>
-                <w:color w:val="1E293B"/>
-                <w:sz w:val="19"/>
-                <w:szCs w:val="19"/>
-              </w:rPr>
-            </w:pPr>
-            <w:r>
-              <w:rPr>
-                <w:rFonts w:ascii="Calibri" w:eastAsia="Times New Roman" w:hAnsi="Calibri" w:cs="Calibri"/>
-                <w:color w:val="1E293B"/>
-                <w:sz w:val="19"/>
-                <w:szCs w:val="19"/>
-              </w:rPr>
+              <w:t xml:space="preserve">Indirect user. Profile, license credentials, and duty availability (Available, On Duty, Leave, Inactive) </w:t>
+            </w:r>
+            <w:r>
+              <w:rPr>
+                <w:rFonts w:ascii="Calibri" w:eastAsia="Times New Roman" w:hAnsi="Calibri" w:cs="Calibri"/>
+                <w:color w:val="1E293B"/>
+                <w:sz w:val="19"/>
+                <w:szCs w:val="19"/>
+              </w:rPr>
+              <w:lastRenderedPageBreak/>
+              <w:t>are managed by Staff and Admin. Scheduled for practical sessions.</w:t>
+            </w:r>
+          </w:p>
+        </w:tc>
+        <w:tc>
+          <w:tcPr>
+            <w:tcW w:w="0" w:type="auto"/>
+            <w:tcBorders>
+              <w:top w:val="single" w:sz="6" w:space="0" w:color="CBD5E1"/>
+              <w:left w:val="single" w:sz="6" w:space="0" w:color="CBD5E1"/>
+              <w:bottom w:val="single" w:sz="6" w:space="0" w:color="CBD5E1"/>
+              <w:right w:val="single" w:sz="6" w:space="0" w:color="CBD5E1"/>
+            </w:tcBorders>
+            <w:tcMar>
+              <w:top w:w="120" w:type="dxa"/>
+              <w:left w:w="160" w:type="dxa"/>
+              <w:bottom w:w="120" w:type="dxa"/>
+              <w:right w:w="160" w:type="dxa"/>
+            </w:tcMar>
+            <w:hideMark/>
+          </w:tcPr>
+          <w:p>
+            <w:pPr>
+              <w:spacing w:before="200" w:after="280"/>
+              <w:rPr>
+                <w:rFonts w:ascii="Calibri" w:eastAsia="Times New Roman" w:hAnsi="Calibri" w:cs="Calibri"/>
+                <w:color w:val="1E293B"/>
+                <w:sz w:val="19"/>
+                <w:szCs w:val="19"/>
+              </w:rPr>
+            </w:pPr>
+            <w:r>
+              <w:rPr>
+                <w:rFonts w:ascii="Calibri" w:eastAsia="Times New Roman" w:hAnsi="Calibri" w:cs="Calibri"/>
+                <w:color w:val="1E293B"/>
+                <w:sz w:val="19"/>
+                <w:szCs w:val="19"/>
+              </w:rPr>
+              <w:lastRenderedPageBreak/>
               <w:t>Data Entity / Resource Tier</w:t>
             </w:r>
           </w:p>
@@ -10291,7 +10287,6 @@
           <w:szCs w:val="22"/>
           <w:lang w:val="en"/>
         </w:rPr>
-        <w:lastRenderedPageBreak/>
         <w:t>Hard Disk Storage:</w:t>
       </w:r>
       <w:r>
@@ -10809,7 +10804,6 @@
         <w:t xml:space="preserve"> Long-running database operations must update Swing components strictly within the Event Dispatch Thread (</w:t>
       </w:r>
       <w:proofErr w:type="spellStart"/>
-      <w:proofErr w:type="gramStart"/>
       <w:r>
         <w:rPr>
           <w:rStyle w:val="HTMLCode"/>
@@ -10818,7 +10812,6 @@
         <w:t>java.awt.EventQueue.invokeLater</w:t>
       </w:r>
       <w:proofErr w:type="spellEnd"/>
-      <w:proofErr w:type="gramEnd"/>
       <w:r>
         <w:rPr>
           <w:rFonts w:ascii="Calibri" w:eastAsia="Times New Roman" w:hAnsi="Calibri" w:cs="Calibri"/>
@@ -10844,6 +10837,7 @@
           <w:rFonts w:eastAsia="Times New Roman"/>
           <w:lang w:val="en"/>
         </w:rPr>
+        <w:lastRenderedPageBreak/>
         <w:t>4. System Architecture, Data Models &amp; Algorithms</w:t>
       </w:r>
       <w:bookmarkEnd w:id="25"/>
@@ -10902,7 +10896,6 @@
           <w:rFonts w:eastAsia="Times New Roman"/>
           <w:lang w:val="en"/>
         </w:rPr>
-        <w:lastRenderedPageBreak/>
         <w:t xml:space="preserve">Table 1: </w:t>
       </w:r>
       <w:r>
@@ -10933,11 +10926,11 @@
         <w:tblLook w:val="04A0" w:firstRow="1" w:lastRow="0" w:firstColumn="1" w:lastColumn="0" w:noHBand="0" w:noVBand="1"/>
       </w:tblPr>
       <w:tblGrid>
-        <w:gridCol w:w="1387"/>
+        <w:gridCol w:w="1401"/>
         <w:gridCol w:w="1478"/>
-        <w:gridCol w:w="2145"/>
+        <w:gridCol w:w="2350"/>
         <w:gridCol w:w="904"/>
-        <w:gridCol w:w="3430"/>
+        <w:gridCol w:w="4317"/>
       </w:tblGrid>
       <w:tr>
         <w:trPr>
@@ -11413,25 +11406,14 @@
                 <w:szCs w:val="19"/>
               </w:rPr>
             </w:pPr>
-            <w:proofErr w:type="gramStart"/>
-            <w:r>
-              <w:rPr>
-                <w:rFonts w:ascii="Calibri" w:eastAsia="Times New Roman" w:hAnsi="Calibri" w:cs="Calibri"/>
-                <w:color w:val="1E293B"/>
-                <w:sz w:val="19"/>
-                <w:szCs w:val="19"/>
-              </w:rPr>
-              <w:t>VARCHAR(</w:t>
-            </w:r>
-            <w:proofErr w:type="gramEnd"/>
-            <w:r>
-              <w:rPr>
-                <w:rFonts w:ascii="Calibri" w:eastAsia="Times New Roman" w:hAnsi="Calibri" w:cs="Calibri"/>
-                <w:color w:val="1E293B"/>
-                <w:sz w:val="19"/>
-                <w:szCs w:val="19"/>
-              </w:rPr>
-              <w:t>50)</w:t>
+            <w:r>
+              <w:rPr>
+                <w:rFonts w:ascii="Calibri" w:eastAsia="Times New Roman" w:hAnsi="Calibri" w:cs="Calibri"/>
+                <w:color w:val="1E293B"/>
+                <w:sz w:val="19"/>
+                <w:szCs w:val="19"/>
+              </w:rPr>
+              <w:t>VARCHAR(50)</w:t>
             </w:r>
           </w:p>
         </w:tc>
@@ -11613,25 +11595,14 @@
                 <w:szCs w:val="19"/>
               </w:rPr>
             </w:pPr>
-            <w:proofErr w:type="gramStart"/>
-            <w:r>
-              <w:rPr>
-                <w:rFonts w:ascii="Calibri" w:eastAsia="Times New Roman" w:hAnsi="Calibri" w:cs="Calibri"/>
-                <w:color w:val="1E293B"/>
-                <w:sz w:val="19"/>
-                <w:szCs w:val="19"/>
-              </w:rPr>
-              <w:t>VARCHAR(</w:t>
-            </w:r>
-            <w:proofErr w:type="gramEnd"/>
-            <w:r>
-              <w:rPr>
-                <w:rFonts w:ascii="Calibri" w:eastAsia="Times New Roman" w:hAnsi="Calibri" w:cs="Calibri"/>
-                <w:color w:val="1E293B"/>
-                <w:sz w:val="19"/>
-                <w:szCs w:val="19"/>
-              </w:rPr>
-              <w:t>20)</w:t>
+            <w:r>
+              <w:rPr>
+                <w:rFonts w:ascii="Calibri" w:eastAsia="Times New Roman" w:hAnsi="Calibri" w:cs="Calibri"/>
+                <w:color w:val="1E293B"/>
+                <w:sz w:val="19"/>
+                <w:szCs w:val="19"/>
+              </w:rPr>
+              <w:t>VARCHAR(20)</w:t>
             </w:r>
           </w:p>
         </w:tc>
@@ -11813,25 +11784,14 @@
                 <w:szCs w:val="19"/>
               </w:rPr>
             </w:pPr>
-            <w:proofErr w:type="gramStart"/>
-            <w:r>
-              <w:rPr>
-                <w:rFonts w:ascii="Calibri" w:eastAsia="Times New Roman" w:hAnsi="Calibri" w:cs="Calibri"/>
-                <w:color w:val="1E293B"/>
-                <w:sz w:val="19"/>
-                <w:szCs w:val="19"/>
-              </w:rPr>
-              <w:t>VARCHAR(</w:t>
-            </w:r>
-            <w:proofErr w:type="gramEnd"/>
-            <w:r>
-              <w:rPr>
-                <w:rFonts w:ascii="Calibri" w:eastAsia="Times New Roman" w:hAnsi="Calibri" w:cs="Calibri"/>
-                <w:color w:val="1E293B"/>
-                <w:sz w:val="19"/>
-                <w:szCs w:val="19"/>
-              </w:rPr>
-              <w:t>255)</w:t>
+            <w:r>
+              <w:rPr>
+                <w:rFonts w:ascii="Calibri" w:eastAsia="Times New Roman" w:hAnsi="Calibri" w:cs="Calibri"/>
+                <w:color w:val="1E293B"/>
+                <w:sz w:val="19"/>
+                <w:szCs w:val="19"/>
+              </w:rPr>
+              <w:t>VARCHAR(255)</w:t>
             </w:r>
           </w:p>
         </w:tc>
@@ -12013,25 +11973,14 @@
                 <w:szCs w:val="19"/>
               </w:rPr>
             </w:pPr>
-            <w:proofErr w:type="gramStart"/>
-            <w:r>
-              <w:rPr>
-                <w:rFonts w:ascii="Calibri" w:eastAsia="Times New Roman" w:hAnsi="Calibri" w:cs="Calibri"/>
-                <w:color w:val="1E293B"/>
-                <w:sz w:val="19"/>
-                <w:szCs w:val="19"/>
-              </w:rPr>
-              <w:t>VARCHAR(</w:t>
-            </w:r>
-            <w:proofErr w:type="gramEnd"/>
-            <w:r>
-              <w:rPr>
-                <w:rFonts w:ascii="Calibri" w:eastAsia="Times New Roman" w:hAnsi="Calibri" w:cs="Calibri"/>
-                <w:color w:val="1E293B"/>
-                <w:sz w:val="19"/>
-                <w:szCs w:val="19"/>
-              </w:rPr>
-              <w:t>20)</w:t>
+            <w:r>
+              <w:rPr>
+                <w:rFonts w:ascii="Calibri" w:eastAsia="Times New Roman" w:hAnsi="Calibri" w:cs="Calibri"/>
+                <w:color w:val="1E293B"/>
+                <w:sz w:val="19"/>
+                <w:szCs w:val="19"/>
+              </w:rPr>
+              <w:t>VARCHAR(20)</w:t>
             </w:r>
           </w:p>
         </w:tc>
@@ -12448,9 +12397,9 @@
       <w:tblGrid>
         <w:gridCol w:w="1679"/>
         <w:gridCol w:w="1478"/>
-        <w:gridCol w:w="1392"/>
-        <w:gridCol w:w="1113"/>
-        <w:gridCol w:w="3682"/>
+        <w:gridCol w:w="1472"/>
+        <w:gridCol w:w="1187"/>
+        <w:gridCol w:w="4634"/>
       </w:tblGrid>
       <w:tr>
         <w:trPr>
@@ -12926,7 +12875,6 @@
               <w:rPr>
                 <w:rStyle w:val="HTMLCode"/>
               </w:rPr>
-              <w:lastRenderedPageBreak/>
               <w:t>full_name</w:t>
             </w:r>
             <w:proofErr w:type="spellEnd"/>
@@ -12959,25 +12907,14 @@
                 <w:szCs w:val="19"/>
               </w:rPr>
             </w:pPr>
-            <w:proofErr w:type="gramStart"/>
-            <w:r>
-              <w:rPr>
-                <w:rFonts w:ascii="Calibri" w:eastAsia="Times New Roman" w:hAnsi="Calibri" w:cs="Calibri"/>
-                <w:color w:val="1E293B"/>
-                <w:sz w:val="19"/>
-                <w:szCs w:val="19"/>
-              </w:rPr>
-              <w:t>VARCHAR(</w:t>
-            </w:r>
-            <w:proofErr w:type="gramEnd"/>
-            <w:r>
-              <w:rPr>
-                <w:rFonts w:ascii="Calibri" w:eastAsia="Times New Roman" w:hAnsi="Calibri" w:cs="Calibri"/>
-                <w:color w:val="1E293B"/>
-                <w:sz w:val="19"/>
-                <w:szCs w:val="19"/>
-              </w:rPr>
-              <w:t>100)</w:t>
+            <w:r>
+              <w:rPr>
+                <w:rFonts w:ascii="Calibri" w:eastAsia="Times New Roman" w:hAnsi="Calibri" w:cs="Calibri"/>
+                <w:color w:val="1E293B"/>
+                <w:sz w:val="19"/>
+                <w:szCs w:val="19"/>
+              </w:rPr>
+              <w:t>VARCHAR(100)</w:t>
             </w:r>
           </w:p>
         </w:tc>
@@ -13128,6 +13065,7 @@
               <w:rPr>
                 <w:rStyle w:val="HTMLCode"/>
               </w:rPr>
+              <w:lastRenderedPageBreak/>
               <w:t>nic</w:t>
             </w:r>
           </w:p>
@@ -13159,25 +13097,14 @@
                 <w:szCs w:val="19"/>
               </w:rPr>
             </w:pPr>
-            <w:proofErr w:type="gramStart"/>
-            <w:r>
-              <w:rPr>
-                <w:rFonts w:ascii="Calibri" w:eastAsia="Times New Roman" w:hAnsi="Calibri" w:cs="Calibri"/>
-                <w:color w:val="1E293B"/>
-                <w:sz w:val="19"/>
-                <w:szCs w:val="19"/>
-              </w:rPr>
-              <w:t>VARCHAR(</w:t>
-            </w:r>
-            <w:proofErr w:type="gramEnd"/>
-            <w:r>
-              <w:rPr>
-                <w:rFonts w:ascii="Calibri" w:eastAsia="Times New Roman" w:hAnsi="Calibri" w:cs="Calibri"/>
-                <w:color w:val="1E293B"/>
-                <w:sz w:val="19"/>
-                <w:szCs w:val="19"/>
-              </w:rPr>
-              <w:t>20)</w:t>
+            <w:r>
+              <w:rPr>
+                <w:rFonts w:ascii="Calibri" w:eastAsia="Times New Roman" w:hAnsi="Calibri" w:cs="Calibri"/>
+                <w:color w:val="1E293B"/>
+                <w:sz w:val="19"/>
+                <w:szCs w:val="19"/>
+              </w:rPr>
+              <w:t>VARCHAR(20)</w:t>
             </w:r>
           </w:p>
         </w:tc>
@@ -13359,25 +13286,14 @@
                 <w:szCs w:val="19"/>
               </w:rPr>
             </w:pPr>
-            <w:proofErr w:type="gramStart"/>
-            <w:r>
-              <w:rPr>
-                <w:rFonts w:ascii="Calibri" w:eastAsia="Times New Roman" w:hAnsi="Calibri" w:cs="Calibri"/>
-                <w:color w:val="1E293B"/>
-                <w:sz w:val="19"/>
-                <w:szCs w:val="19"/>
-              </w:rPr>
-              <w:t>VARCHAR(</w:t>
-            </w:r>
-            <w:proofErr w:type="gramEnd"/>
-            <w:r>
-              <w:rPr>
-                <w:rFonts w:ascii="Calibri" w:eastAsia="Times New Roman" w:hAnsi="Calibri" w:cs="Calibri"/>
-                <w:color w:val="1E293B"/>
-                <w:sz w:val="19"/>
-                <w:szCs w:val="19"/>
-              </w:rPr>
-              <w:t>15)</w:t>
+            <w:r>
+              <w:rPr>
+                <w:rFonts w:ascii="Calibri" w:eastAsia="Times New Roman" w:hAnsi="Calibri" w:cs="Calibri"/>
+                <w:color w:val="1E293B"/>
+                <w:sz w:val="19"/>
+                <w:szCs w:val="19"/>
+              </w:rPr>
+              <w:t>VARCHAR(15)</w:t>
             </w:r>
           </w:p>
         </w:tc>
@@ -13559,25 +13475,14 @@
                 <w:szCs w:val="19"/>
               </w:rPr>
             </w:pPr>
-            <w:proofErr w:type="gramStart"/>
-            <w:r>
-              <w:rPr>
-                <w:rFonts w:ascii="Calibri" w:eastAsia="Times New Roman" w:hAnsi="Calibri" w:cs="Calibri"/>
-                <w:color w:val="1E293B"/>
-                <w:sz w:val="19"/>
-                <w:szCs w:val="19"/>
-              </w:rPr>
-              <w:t>VARCHAR(</w:t>
-            </w:r>
-            <w:proofErr w:type="gramEnd"/>
-            <w:r>
-              <w:rPr>
-                <w:rFonts w:ascii="Calibri" w:eastAsia="Times New Roman" w:hAnsi="Calibri" w:cs="Calibri"/>
-                <w:color w:val="1E293B"/>
-                <w:sz w:val="19"/>
-                <w:szCs w:val="19"/>
-              </w:rPr>
-              <w:t>200)</w:t>
+            <w:r>
+              <w:rPr>
+                <w:rFonts w:ascii="Calibri" w:eastAsia="Times New Roman" w:hAnsi="Calibri" w:cs="Calibri"/>
+                <w:color w:val="1E293B"/>
+                <w:sz w:val="19"/>
+                <w:szCs w:val="19"/>
+              </w:rPr>
+              <w:t>VARCHAR(200)</w:t>
             </w:r>
           </w:p>
         </w:tc>
@@ -13761,25 +13666,14 @@
                 <w:szCs w:val="19"/>
               </w:rPr>
             </w:pPr>
-            <w:proofErr w:type="gramStart"/>
-            <w:r>
-              <w:rPr>
-                <w:rFonts w:ascii="Calibri" w:eastAsia="Times New Roman" w:hAnsi="Calibri" w:cs="Calibri"/>
-                <w:color w:val="1E293B"/>
-                <w:sz w:val="19"/>
-                <w:szCs w:val="19"/>
-              </w:rPr>
-              <w:t>VARCHAR(</w:t>
-            </w:r>
-            <w:proofErr w:type="gramEnd"/>
-            <w:r>
-              <w:rPr>
-                <w:rFonts w:ascii="Calibri" w:eastAsia="Times New Roman" w:hAnsi="Calibri" w:cs="Calibri"/>
-                <w:color w:val="1E293B"/>
-                <w:sz w:val="19"/>
-                <w:szCs w:val="19"/>
-              </w:rPr>
-              <w:t>50)</w:t>
+            <w:r>
+              <w:rPr>
+                <w:rFonts w:ascii="Calibri" w:eastAsia="Times New Roman" w:hAnsi="Calibri" w:cs="Calibri"/>
+                <w:color w:val="1E293B"/>
+                <w:sz w:val="19"/>
+                <w:szCs w:val="19"/>
+              </w:rPr>
+              <w:t>VARCHAR(50)</w:t>
             </w:r>
           </w:p>
         </w:tc>
@@ -14006,25 +13900,14 @@
                 <w:szCs w:val="19"/>
               </w:rPr>
             </w:pPr>
-            <w:proofErr w:type="gramStart"/>
-            <w:r>
-              <w:rPr>
-                <w:rFonts w:ascii="Calibri" w:eastAsia="Times New Roman" w:hAnsi="Calibri" w:cs="Calibri"/>
-                <w:color w:val="1E293B"/>
-                <w:sz w:val="19"/>
-                <w:szCs w:val="19"/>
-              </w:rPr>
-              <w:t>VARCHAR(</w:t>
-            </w:r>
-            <w:proofErr w:type="gramEnd"/>
-            <w:r>
-              <w:rPr>
-                <w:rFonts w:ascii="Calibri" w:eastAsia="Times New Roman" w:hAnsi="Calibri" w:cs="Calibri"/>
-                <w:color w:val="1E293B"/>
-                <w:sz w:val="19"/>
-                <w:szCs w:val="19"/>
-              </w:rPr>
-              <w:t>20)</w:t>
+            <w:r>
+              <w:rPr>
+                <w:rFonts w:ascii="Calibri" w:eastAsia="Times New Roman" w:hAnsi="Calibri" w:cs="Calibri"/>
+                <w:color w:val="1E293B"/>
+                <w:sz w:val="19"/>
+                <w:szCs w:val="19"/>
+              </w:rPr>
+              <w:t>VARCHAR(20)</w:t>
             </w:r>
           </w:p>
         </w:tc>
@@ -14250,9 +14133,9 @@
       <w:tblGrid>
         <w:gridCol w:w="1783"/>
         <w:gridCol w:w="1478"/>
-        <w:gridCol w:w="1402"/>
-        <w:gridCol w:w="1191"/>
-        <w:gridCol w:w="3490"/>
+        <w:gridCol w:w="1501"/>
+        <w:gridCol w:w="1237"/>
+        <w:gridCol w:w="4451"/>
       </w:tblGrid>
       <w:tr>
         <w:trPr>
@@ -14760,25 +14643,14 @@
                 <w:szCs w:val="19"/>
               </w:rPr>
             </w:pPr>
-            <w:proofErr w:type="gramStart"/>
-            <w:r>
-              <w:rPr>
-                <w:rFonts w:ascii="Calibri" w:eastAsia="Times New Roman" w:hAnsi="Calibri" w:cs="Calibri"/>
-                <w:color w:val="1E293B"/>
-                <w:sz w:val="19"/>
-                <w:szCs w:val="19"/>
-              </w:rPr>
-              <w:t>VARCHAR(</w:t>
-            </w:r>
-            <w:proofErr w:type="gramEnd"/>
-            <w:r>
-              <w:rPr>
-                <w:rFonts w:ascii="Calibri" w:eastAsia="Times New Roman" w:hAnsi="Calibri" w:cs="Calibri"/>
-                <w:color w:val="1E293B"/>
-                <w:sz w:val="19"/>
-                <w:szCs w:val="19"/>
-              </w:rPr>
-              <w:t>100)</w:t>
+            <w:r>
+              <w:rPr>
+                <w:rFonts w:ascii="Calibri" w:eastAsia="Times New Roman" w:hAnsi="Calibri" w:cs="Calibri"/>
+                <w:color w:val="1E293B"/>
+                <w:sz w:val="19"/>
+                <w:szCs w:val="19"/>
+              </w:rPr>
+              <w:t>VARCHAR(100)</w:t>
             </w:r>
           </w:p>
         </w:tc>
@@ -14929,7 +14801,6 @@
               <w:rPr>
                 <w:rStyle w:val="HTMLCode"/>
               </w:rPr>
-              <w:lastRenderedPageBreak/>
               <w:t>phone</w:t>
             </w:r>
           </w:p>
@@ -14961,25 +14832,14 @@
                 <w:szCs w:val="19"/>
               </w:rPr>
             </w:pPr>
-            <w:proofErr w:type="gramStart"/>
-            <w:r>
-              <w:rPr>
-                <w:rFonts w:ascii="Calibri" w:eastAsia="Times New Roman" w:hAnsi="Calibri" w:cs="Calibri"/>
-                <w:color w:val="1E293B"/>
-                <w:sz w:val="19"/>
-                <w:szCs w:val="19"/>
-              </w:rPr>
-              <w:t>VARCHAR(</w:t>
-            </w:r>
-            <w:proofErr w:type="gramEnd"/>
-            <w:r>
-              <w:rPr>
-                <w:rFonts w:ascii="Calibri" w:eastAsia="Times New Roman" w:hAnsi="Calibri" w:cs="Calibri"/>
-                <w:color w:val="1E293B"/>
-                <w:sz w:val="19"/>
-                <w:szCs w:val="19"/>
-              </w:rPr>
-              <w:t>15)</w:t>
+            <w:r>
+              <w:rPr>
+                <w:rFonts w:ascii="Calibri" w:eastAsia="Times New Roman" w:hAnsi="Calibri" w:cs="Calibri"/>
+                <w:color w:val="1E293B"/>
+                <w:sz w:val="19"/>
+                <w:szCs w:val="19"/>
+              </w:rPr>
+              <w:t>VARCHAR(15)</w:t>
             </w:r>
           </w:p>
         </w:tc>
@@ -15086,25 +14946,14 @@
                 <w:szCs w:val="19"/>
               </w:rPr>
             </w:pPr>
-            <w:proofErr w:type="gramStart"/>
-            <w:r>
-              <w:rPr>
-                <w:rFonts w:ascii="Calibri" w:eastAsia="Times New Roman" w:hAnsi="Calibri" w:cs="Calibri"/>
-                <w:color w:val="1E293B"/>
-                <w:sz w:val="19"/>
-                <w:szCs w:val="19"/>
-              </w:rPr>
-              <w:t>Instructor</w:t>
-            </w:r>
-            <w:proofErr w:type="gramEnd"/>
-            <w:r>
-              <w:rPr>
-                <w:rFonts w:ascii="Calibri" w:eastAsia="Times New Roman" w:hAnsi="Calibri" w:cs="Calibri"/>
-                <w:color w:val="1E293B"/>
-                <w:sz w:val="19"/>
-                <w:szCs w:val="19"/>
-              </w:rPr>
-              <w:t xml:space="preserve"> contact mobile number.</w:t>
+            <w:r>
+              <w:rPr>
+                <w:rFonts w:ascii="Calibri" w:eastAsia="Times New Roman" w:hAnsi="Calibri" w:cs="Calibri"/>
+                <w:color w:val="1E293B"/>
+                <w:sz w:val="19"/>
+                <w:szCs w:val="19"/>
+              </w:rPr>
+              <w:t>Instructor contact mobile number.</w:t>
             </w:r>
           </w:p>
         </w:tc>
@@ -15172,25 +15021,14 @@
                 <w:szCs w:val="19"/>
               </w:rPr>
             </w:pPr>
-            <w:proofErr w:type="gramStart"/>
-            <w:r>
-              <w:rPr>
-                <w:rFonts w:ascii="Calibri" w:eastAsia="Times New Roman" w:hAnsi="Calibri" w:cs="Calibri"/>
-                <w:color w:val="1E293B"/>
-                <w:sz w:val="19"/>
-                <w:szCs w:val="19"/>
-              </w:rPr>
-              <w:t>VARCHAR(</w:t>
-            </w:r>
-            <w:proofErr w:type="gramEnd"/>
-            <w:r>
-              <w:rPr>
-                <w:rFonts w:ascii="Calibri" w:eastAsia="Times New Roman" w:hAnsi="Calibri" w:cs="Calibri"/>
-                <w:color w:val="1E293B"/>
-                <w:sz w:val="19"/>
-                <w:szCs w:val="19"/>
-              </w:rPr>
-              <w:t>20)</w:t>
+            <w:r>
+              <w:rPr>
+                <w:rFonts w:ascii="Calibri" w:eastAsia="Times New Roman" w:hAnsi="Calibri" w:cs="Calibri"/>
+                <w:color w:val="1E293B"/>
+                <w:sz w:val="19"/>
+                <w:szCs w:val="19"/>
+              </w:rPr>
+              <w:t>VARCHAR(20)</w:t>
             </w:r>
           </w:p>
         </w:tc>
@@ -15374,25 +15212,14 @@
                 <w:szCs w:val="19"/>
               </w:rPr>
             </w:pPr>
-            <w:proofErr w:type="gramStart"/>
-            <w:r>
-              <w:rPr>
-                <w:rFonts w:ascii="Calibri" w:eastAsia="Times New Roman" w:hAnsi="Calibri" w:cs="Calibri"/>
-                <w:color w:val="1E293B"/>
-                <w:sz w:val="19"/>
-                <w:szCs w:val="19"/>
-              </w:rPr>
-              <w:t>VARCHAR(</w:t>
-            </w:r>
-            <w:proofErr w:type="gramEnd"/>
-            <w:r>
-              <w:rPr>
-                <w:rFonts w:ascii="Calibri" w:eastAsia="Times New Roman" w:hAnsi="Calibri" w:cs="Calibri"/>
-                <w:color w:val="1E293B"/>
-                <w:sz w:val="19"/>
-                <w:szCs w:val="19"/>
-              </w:rPr>
-              <w:t>50)</w:t>
+            <w:r>
+              <w:rPr>
+                <w:rFonts w:ascii="Calibri" w:eastAsia="Times New Roman" w:hAnsi="Calibri" w:cs="Calibri"/>
+                <w:color w:val="1E293B"/>
+                <w:sz w:val="19"/>
+                <w:szCs w:val="19"/>
+              </w:rPr>
+              <w:t>VARCHAR(50)</w:t>
             </w:r>
           </w:p>
         </w:tc>
@@ -15574,25 +15401,14 @@
                 <w:szCs w:val="19"/>
               </w:rPr>
             </w:pPr>
-            <w:proofErr w:type="gramStart"/>
-            <w:r>
-              <w:rPr>
-                <w:rFonts w:ascii="Calibri" w:eastAsia="Times New Roman" w:hAnsi="Calibri" w:cs="Calibri"/>
-                <w:color w:val="1E293B"/>
-                <w:sz w:val="19"/>
-                <w:szCs w:val="19"/>
-              </w:rPr>
-              <w:t>VARCHAR(</w:t>
-            </w:r>
-            <w:proofErr w:type="gramEnd"/>
-            <w:r>
-              <w:rPr>
-                <w:rFonts w:ascii="Calibri" w:eastAsia="Times New Roman" w:hAnsi="Calibri" w:cs="Calibri"/>
-                <w:color w:val="1E293B"/>
-                <w:sz w:val="19"/>
-                <w:szCs w:val="19"/>
-              </w:rPr>
-              <w:t>50)</w:t>
+            <w:r>
+              <w:rPr>
+                <w:rFonts w:ascii="Calibri" w:eastAsia="Times New Roman" w:hAnsi="Calibri" w:cs="Calibri"/>
+                <w:color w:val="1E293B"/>
+                <w:sz w:val="19"/>
+                <w:szCs w:val="19"/>
+              </w:rPr>
+              <w:t>VARCHAR(50)</w:t>
             </w:r>
           </w:p>
         </w:tc>
@@ -15706,27 +15522,7 @@
                 <w:sz w:val="19"/>
                 <w:szCs w:val="19"/>
               </w:rPr>
-              <w:t xml:space="preserve">Specialization </w:t>
-            </w:r>
-            <w:proofErr w:type="gramStart"/>
-            <w:r>
-              <w:rPr>
-                <w:rFonts w:ascii="Calibri" w:eastAsia="Times New Roman" w:hAnsi="Calibri" w:cs="Calibri"/>
-                <w:color w:val="1E293B"/>
-                <w:sz w:val="19"/>
-                <w:szCs w:val="19"/>
-              </w:rPr>
-              <w:t>category</w:t>
-            </w:r>
-            <w:proofErr w:type="gramEnd"/>
-            <w:r>
-              <w:rPr>
-                <w:rFonts w:ascii="Calibri" w:eastAsia="Times New Roman" w:hAnsi="Calibri" w:cs="Calibri"/>
-                <w:color w:val="1E293B"/>
-                <w:sz w:val="19"/>
-                <w:szCs w:val="19"/>
-              </w:rPr>
-              <w:t xml:space="preserve">: </w:t>
+              <w:t xml:space="preserve">Specialization category: </w:t>
             </w:r>
             <w:r>
               <w:rPr>
@@ -15808,6 +15604,7 @@
               <w:rPr>
                 <w:rStyle w:val="HTMLCode"/>
               </w:rPr>
+              <w:lastRenderedPageBreak/>
               <w:t>status</w:t>
             </w:r>
           </w:p>
@@ -15839,25 +15636,14 @@
                 <w:szCs w:val="19"/>
               </w:rPr>
             </w:pPr>
-            <w:proofErr w:type="gramStart"/>
-            <w:r>
-              <w:rPr>
-                <w:rFonts w:ascii="Calibri" w:eastAsia="Times New Roman" w:hAnsi="Calibri" w:cs="Calibri"/>
-                <w:color w:val="1E293B"/>
-                <w:sz w:val="19"/>
-                <w:szCs w:val="19"/>
-              </w:rPr>
-              <w:t>VARCHAR(</w:t>
-            </w:r>
-            <w:proofErr w:type="gramEnd"/>
-            <w:r>
-              <w:rPr>
-                <w:rFonts w:ascii="Calibri" w:eastAsia="Times New Roman" w:hAnsi="Calibri" w:cs="Calibri"/>
-                <w:color w:val="1E293B"/>
-                <w:sz w:val="19"/>
-                <w:szCs w:val="19"/>
-              </w:rPr>
-              <w:t>20)</w:t>
+            <w:r>
+              <w:rPr>
+                <w:rFonts w:ascii="Calibri" w:eastAsia="Times New Roman" w:hAnsi="Calibri" w:cs="Calibri"/>
+                <w:color w:val="1E293B"/>
+                <w:sz w:val="19"/>
+                <w:szCs w:val="19"/>
+              </w:rPr>
+              <w:t>VARCHAR(20)</w:t>
             </w:r>
           </w:p>
         </w:tc>
@@ -16083,9 +15869,9 @@
       <w:tblGrid>
         <w:gridCol w:w="1783"/>
         <w:gridCol w:w="1382"/>
-        <w:gridCol w:w="1518"/>
+        <w:gridCol w:w="1660"/>
         <w:gridCol w:w="1107"/>
-        <w:gridCol w:w="3554"/>
+        <w:gridCol w:w="4518"/>
       </w:tblGrid>
       <w:tr>
         <w:trPr>
@@ -16593,25 +16379,14 @@
                 <w:szCs w:val="19"/>
               </w:rPr>
             </w:pPr>
-            <w:proofErr w:type="gramStart"/>
-            <w:r>
-              <w:rPr>
-                <w:rFonts w:ascii="Calibri" w:eastAsia="Times New Roman" w:hAnsi="Calibri" w:cs="Calibri"/>
-                <w:color w:val="1E293B"/>
-                <w:sz w:val="19"/>
-                <w:szCs w:val="19"/>
-              </w:rPr>
-              <w:t>VARCHAR(</w:t>
-            </w:r>
-            <w:proofErr w:type="gramEnd"/>
-            <w:r>
-              <w:rPr>
-                <w:rFonts w:ascii="Calibri" w:eastAsia="Times New Roman" w:hAnsi="Calibri" w:cs="Calibri"/>
-                <w:color w:val="1E293B"/>
-                <w:sz w:val="19"/>
-                <w:szCs w:val="19"/>
-              </w:rPr>
-              <w:t>20)</w:t>
+            <w:r>
+              <w:rPr>
+                <w:rFonts w:ascii="Calibri" w:eastAsia="Times New Roman" w:hAnsi="Calibri" w:cs="Calibri"/>
+                <w:color w:val="1E293B"/>
+                <w:sz w:val="19"/>
+                <w:szCs w:val="19"/>
+              </w:rPr>
+              <w:t>VARCHAR(20)</w:t>
             </w:r>
           </w:p>
         </w:tc>
@@ -16808,25 +16583,14 @@
                 <w:szCs w:val="19"/>
               </w:rPr>
             </w:pPr>
-            <w:proofErr w:type="gramStart"/>
-            <w:r>
-              <w:rPr>
-                <w:rFonts w:ascii="Calibri" w:eastAsia="Times New Roman" w:hAnsi="Calibri" w:cs="Calibri"/>
-                <w:color w:val="1E293B"/>
-                <w:sz w:val="19"/>
-                <w:szCs w:val="19"/>
-              </w:rPr>
-              <w:t>VARCHAR(</w:t>
-            </w:r>
-            <w:proofErr w:type="gramEnd"/>
-            <w:r>
-              <w:rPr>
-                <w:rFonts w:ascii="Calibri" w:eastAsia="Times New Roman" w:hAnsi="Calibri" w:cs="Calibri"/>
-                <w:color w:val="1E293B"/>
-                <w:sz w:val="19"/>
-                <w:szCs w:val="19"/>
-              </w:rPr>
-              <w:t>50)</w:t>
+            <w:r>
+              <w:rPr>
+                <w:rFonts w:ascii="Calibri" w:eastAsia="Times New Roman" w:hAnsi="Calibri" w:cs="Calibri"/>
+                <w:color w:val="1E293B"/>
+                <w:sz w:val="19"/>
+                <w:szCs w:val="19"/>
+              </w:rPr>
+              <w:t>VARCHAR(50)</w:t>
             </w:r>
           </w:p>
         </w:tc>
@@ -17015,7 +16779,6 @@
               <w:rPr>
                 <w:rStyle w:val="HTMLCode"/>
               </w:rPr>
-              <w:lastRenderedPageBreak/>
               <w:t>category</w:t>
             </w:r>
           </w:p>
@@ -17047,25 +16810,14 @@
                 <w:szCs w:val="19"/>
               </w:rPr>
             </w:pPr>
-            <w:proofErr w:type="gramStart"/>
-            <w:r>
-              <w:rPr>
-                <w:rFonts w:ascii="Calibri" w:eastAsia="Times New Roman" w:hAnsi="Calibri" w:cs="Calibri"/>
-                <w:color w:val="1E293B"/>
-                <w:sz w:val="19"/>
-                <w:szCs w:val="19"/>
-              </w:rPr>
-              <w:t>VARCHAR(</w:t>
-            </w:r>
-            <w:proofErr w:type="gramEnd"/>
-            <w:r>
-              <w:rPr>
-                <w:rFonts w:ascii="Calibri" w:eastAsia="Times New Roman" w:hAnsi="Calibri" w:cs="Calibri"/>
-                <w:color w:val="1E293B"/>
-                <w:sz w:val="19"/>
-                <w:szCs w:val="19"/>
-              </w:rPr>
-              <w:t>50)</w:t>
+            <w:r>
+              <w:rPr>
+                <w:rFonts w:ascii="Calibri" w:eastAsia="Times New Roman" w:hAnsi="Calibri" w:cs="Calibri"/>
+                <w:color w:val="1E293B"/>
+                <w:sz w:val="19"/>
+                <w:szCs w:val="19"/>
+              </w:rPr>
+              <w:t>VARCHAR(50)</w:t>
             </w:r>
           </w:p>
         </w:tc>
@@ -17307,25 +17059,14 @@
                 <w:szCs w:val="19"/>
               </w:rPr>
             </w:pPr>
-            <w:proofErr w:type="gramStart"/>
-            <w:r>
-              <w:rPr>
-                <w:rFonts w:ascii="Calibri" w:eastAsia="Times New Roman" w:hAnsi="Calibri" w:cs="Calibri"/>
-                <w:color w:val="1E293B"/>
-                <w:sz w:val="19"/>
-                <w:szCs w:val="19"/>
-              </w:rPr>
-              <w:t>VARCHAR(</w:t>
-            </w:r>
-            <w:proofErr w:type="gramEnd"/>
-            <w:r>
-              <w:rPr>
-                <w:rFonts w:ascii="Calibri" w:eastAsia="Times New Roman" w:hAnsi="Calibri" w:cs="Calibri"/>
-                <w:color w:val="1E293B"/>
-                <w:sz w:val="19"/>
-                <w:szCs w:val="19"/>
-              </w:rPr>
-              <w:t>20)</w:t>
+            <w:r>
+              <w:rPr>
+                <w:rFonts w:ascii="Calibri" w:eastAsia="Times New Roman" w:hAnsi="Calibri" w:cs="Calibri"/>
+                <w:color w:val="1E293B"/>
+                <w:sz w:val="19"/>
+                <w:szCs w:val="19"/>
+              </w:rPr>
+              <w:t>VARCHAR(20)</w:t>
             </w:r>
           </w:p>
         </w:tc>
@@ -17726,25 +17467,14 @@
                 <w:szCs w:val="19"/>
               </w:rPr>
             </w:pPr>
-            <w:proofErr w:type="gramStart"/>
-            <w:r>
-              <w:rPr>
-                <w:rFonts w:ascii="Calibri" w:eastAsia="Times New Roman" w:hAnsi="Calibri" w:cs="Calibri"/>
-                <w:color w:val="1E293B"/>
-                <w:sz w:val="19"/>
-                <w:szCs w:val="19"/>
-              </w:rPr>
-              <w:t>VARCHAR(</w:t>
-            </w:r>
-            <w:proofErr w:type="gramEnd"/>
-            <w:r>
-              <w:rPr>
-                <w:rFonts w:ascii="Calibri" w:eastAsia="Times New Roman" w:hAnsi="Calibri" w:cs="Calibri"/>
-                <w:color w:val="1E293B"/>
-                <w:sz w:val="19"/>
-                <w:szCs w:val="19"/>
-              </w:rPr>
-              <w:t>25)</w:t>
+            <w:r>
+              <w:rPr>
+                <w:rFonts w:ascii="Calibri" w:eastAsia="Times New Roman" w:hAnsi="Calibri" w:cs="Calibri"/>
+                <w:color w:val="1E293B"/>
+                <w:sz w:val="19"/>
+                <w:szCs w:val="19"/>
+              </w:rPr>
+              <w:t>VARCHAR(25)</w:t>
             </w:r>
           </w:p>
         </w:tc>
@@ -17955,9 +17685,9 @@
       <w:tblGrid>
         <w:gridCol w:w="1679"/>
         <w:gridCol w:w="1382"/>
-        <w:gridCol w:w="3183"/>
+        <w:gridCol w:w="3405"/>
         <w:gridCol w:w="1030"/>
-        <w:gridCol w:w="2070"/>
+        <w:gridCol w:w="2954"/>
       </w:tblGrid>
       <w:tr>
         <w:trPr>
@@ -18418,6 +18148,7 @@
               <w:rPr>
                 <w:rStyle w:val="HTMLCode"/>
               </w:rPr>
+              <w:lastRenderedPageBreak/>
               <w:t>student_id</w:t>
             </w:r>
             <w:proofErr w:type="spellEnd"/>
@@ -18840,7 +18571,6 @@
               <w:rPr>
                 <w:rStyle w:val="HTMLCode"/>
               </w:rPr>
-              <w:lastRenderedPageBreak/>
               <w:t>vehicle_id</w:t>
             </w:r>
             <w:proofErr w:type="spellEnd"/>
@@ -19417,16 +19147,8 @@
               <w:rPr>
                 <w:rStyle w:val="HTMLCode"/>
               </w:rPr>
-              <w:t>HH:</w:t>
-            </w:r>
-            <w:proofErr w:type="gramStart"/>
-            <w:r>
-              <w:rPr>
-                <w:rStyle w:val="HTMLCode"/>
-              </w:rPr>
-              <w:t>MM:SS</w:t>
-            </w:r>
-            <w:proofErr w:type="gramEnd"/>
+              <w:t>HH:MM:SS</w:t>
+            </w:r>
             <w:r>
               <w:rPr>
                 <w:rFonts w:ascii="Calibri" w:eastAsia="Times New Roman" w:hAnsi="Calibri" w:cs="Calibri"/>
@@ -19693,25 +19415,14 @@
                 <w:szCs w:val="19"/>
               </w:rPr>
             </w:pPr>
-            <w:proofErr w:type="gramStart"/>
-            <w:r>
-              <w:rPr>
-                <w:rFonts w:ascii="Calibri" w:eastAsia="Times New Roman" w:hAnsi="Calibri" w:cs="Calibri"/>
-                <w:color w:val="1E293B"/>
-                <w:sz w:val="19"/>
-                <w:szCs w:val="19"/>
-              </w:rPr>
-              <w:t>VARCHAR(</w:t>
-            </w:r>
-            <w:proofErr w:type="gramEnd"/>
-            <w:r>
-              <w:rPr>
-                <w:rFonts w:ascii="Calibri" w:eastAsia="Times New Roman" w:hAnsi="Calibri" w:cs="Calibri"/>
-                <w:color w:val="1E293B"/>
-                <w:sz w:val="19"/>
-                <w:szCs w:val="19"/>
-              </w:rPr>
-              <w:t>25)</w:t>
+            <w:r>
+              <w:rPr>
+                <w:rFonts w:ascii="Calibri" w:eastAsia="Times New Roman" w:hAnsi="Calibri" w:cs="Calibri"/>
+                <w:color w:val="1E293B"/>
+                <w:sz w:val="19"/>
+                <w:szCs w:val="19"/>
+              </w:rPr>
+              <w:t>VARCHAR(25)</w:t>
             </w:r>
           </w:p>
         </w:tc>
@@ -19952,9 +19663,9 @@
       <w:tblGrid>
         <w:gridCol w:w="1992"/>
         <w:gridCol w:w="1382"/>
-        <w:gridCol w:w="2306"/>
+        <w:gridCol w:w="2453"/>
         <w:gridCol w:w="912"/>
-        <w:gridCol w:w="2752"/>
+        <w:gridCol w:w="3711"/>
       </w:tblGrid>
       <w:tr>
         <w:trPr>
@@ -20400,7 +20111,6 @@
               <w:rPr>
                 <w:rStyle w:val="HTMLCode"/>
               </w:rPr>
-              <w:lastRenderedPageBreak/>
               <w:t>default_password</w:t>
             </w:r>
             <w:proofErr w:type="spellEnd"/>
@@ -20433,25 +20143,14 @@
                 <w:szCs w:val="19"/>
               </w:rPr>
             </w:pPr>
-            <w:proofErr w:type="gramStart"/>
-            <w:r>
-              <w:rPr>
-                <w:rFonts w:ascii="Calibri" w:eastAsia="Times New Roman" w:hAnsi="Calibri" w:cs="Calibri"/>
-                <w:color w:val="1E293B"/>
-                <w:sz w:val="19"/>
-                <w:szCs w:val="19"/>
-              </w:rPr>
-              <w:t>VARCHAR(</w:t>
-            </w:r>
-            <w:proofErr w:type="gramEnd"/>
-            <w:r>
-              <w:rPr>
-                <w:rFonts w:ascii="Calibri" w:eastAsia="Times New Roman" w:hAnsi="Calibri" w:cs="Calibri"/>
-                <w:color w:val="1E293B"/>
-                <w:sz w:val="19"/>
-                <w:szCs w:val="19"/>
-              </w:rPr>
-              <w:t>50)</w:t>
+            <w:r>
+              <w:rPr>
+                <w:rFonts w:ascii="Calibri" w:eastAsia="Times New Roman" w:hAnsi="Calibri" w:cs="Calibri"/>
+                <w:color w:val="1E293B"/>
+                <w:sz w:val="19"/>
+                <w:szCs w:val="19"/>
+              </w:rPr>
+              <w:t>VARCHAR(50)</w:t>
             </w:r>
           </w:p>
         </w:tc>
@@ -20776,6 +20475,7 @@
           <w:rFonts w:eastAsia="Times New Roman"/>
           <w:lang w:val="en"/>
         </w:rPr>
+        <w:lastRenderedPageBreak/>
         <w:t>4.2 Intelligent Double-Booking &amp; Resource Conflict Prevention Algorithm</w:t>
       </w:r>
       <w:bookmarkEnd w:id="33"/>
@@ -20841,7 +20541,6 @@
           <w:lang w:val="en"/>
         </w:rPr>
       </w:pPr>
-      <w:proofErr w:type="gramStart"/>
       <w:r>
         <w:rPr>
           <w:rFonts w:ascii="Calibri" w:eastAsia="Times New Roman" w:hAnsi="Calibri" w:cs="Calibri"/>
@@ -20850,18 +20549,7 @@
           <w:szCs w:val="20"/>
           <w:lang w:val="en"/>
         </w:rPr>
-        <w:t>Two time</w:t>
-      </w:r>
-      <w:proofErr w:type="gramEnd"/>
-      <w:r>
-        <w:rPr>
-          <w:rFonts w:ascii="Calibri" w:eastAsia="Times New Roman" w:hAnsi="Calibri" w:cs="Calibri"/>
-          <w:color w:val="1E293B"/>
-          <w:sz w:val="20"/>
-          <w:szCs w:val="20"/>
-          <w:lang w:val="en"/>
-        </w:rPr>
-        <w:t xml:space="preserve"> intervals ([S_1, E_1]) and ([S_2, E_2]) overlap if and only if: </w:t>
+        <w:t xml:space="preserve">Two time intervals ([S_1, E_1]) and ([S_2, E_2]) overlap if and only if: </w:t>
       </w:r>
       <w:r>
         <w:rPr>
@@ -21052,21 +20740,7 @@
         <w:rPr>
           <w:lang w:val="en"/>
         </w:rPr>
-        <w:t xml:space="preserve">FROM </w:t>
-      </w:r>
-      <w:proofErr w:type="gramStart"/>
-      <w:r>
-        <w:rPr>
-          <w:lang w:val="en"/>
-        </w:rPr>
-        <w:t>bookings</w:t>
-      </w:r>
-      <w:proofErr w:type="gramEnd"/>
-      <w:r>
-        <w:rPr>
-          <w:lang w:val="en"/>
-        </w:rPr>
-        <w:t xml:space="preserve"> </w:t>
+        <w:t xml:space="preserve">FROM bookings </w:t>
       </w:r>
     </w:p>
     <w:p>
@@ -21083,40 +20757,18 @@
         <w:t xml:space="preserve">WHERE </w:t>
       </w:r>
       <w:proofErr w:type="spellStart"/>
-      <w:proofErr w:type="gramStart"/>
-      <w:r>
-        <w:rPr>
-          <w:lang w:val="en"/>
-        </w:rPr>
-        <w:t>booking</w:t>
-      </w:r>
-      <w:proofErr w:type="gramEnd"/>
-      <w:r>
-        <w:rPr>
-          <w:lang w:val="en"/>
-        </w:rPr>
-        <w:t>_date</w:t>
+      <w:r>
+        <w:rPr>
+          <w:lang w:val="en"/>
+        </w:rPr>
+        <w:t>booking_date</w:t>
       </w:r>
       <w:proofErr w:type="spellEnd"/>
       <w:r>
         <w:rPr>
           <w:lang w:val="en"/>
         </w:rPr>
-        <w:t xml:space="preserve"> </w:t>
-      </w:r>
-      <w:proofErr w:type="gramStart"/>
-      <w:r>
-        <w:rPr>
-          <w:lang w:val="en"/>
-        </w:rPr>
-        <w:t>= ?</w:t>
-      </w:r>
-      <w:proofErr w:type="gramEnd"/>
-      <w:r>
-        <w:rPr>
-          <w:lang w:val="en"/>
-        </w:rPr>
-        <w:t xml:space="preserve"> </w:t>
+        <w:t xml:space="preserve"> = ? </w:t>
       </w:r>
     </w:p>
     <w:p>
@@ -21158,21 +20810,7 @@
         <w:rPr>
           <w:lang w:val="en"/>
         </w:rPr>
-        <w:t xml:space="preserve"> </w:t>
-      </w:r>
-      <w:proofErr w:type="gramStart"/>
-      <w:r>
-        <w:rPr>
-          <w:lang w:val="en"/>
-        </w:rPr>
-        <w:t>= ?</w:t>
-      </w:r>
-      <w:proofErr w:type="gramEnd"/>
-      <w:r>
-        <w:rPr>
-          <w:lang w:val="en"/>
-        </w:rPr>
-        <w:t xml:space="preserve"> OR </w:t>
+        <w:t xml:space="preserve"> = ? OR </w:t>
       </w:r>
       <w:proofErr w:type="spellStart"/>
       <w:r>
@@ -21186,21 +20824,7 @@
         <w:rPr>
           <w:lang w:val="en"/>
         </w:rPr>
-        <w:t xml:space="preserve"> </w:t>
-      </w:r>
-      <w:proofErr w:type="gramStart"/>
-      <w:r>
-        <w:rPr>
-          <w:lang w:val="en"/>
-        </w:rPr>
-        <w:t>= ?</w:t>
-      </w:r>
-      <w:proofErr w:type="gramEnd"/>
-      <w:r>
-        <w:rPr>
-          <w:lang w:val="en"/>
-        </w:rPr>
-        <w:t>)</w:t>
+        <w:t xml:space="preserve"> = ?)</w:t>
       </w:r>
     </w:p>
     <w:p>
@@ -21228,21 +20852,7 @@
         <w:rPr>
           <w:lang w:val="en"/>
         </w:rPr>
-        <w:t xml:space="preserve"> </w:t>
-      </w:r>
-      <w:proofErr w:type="gramStart"/>
-      <w:r>
-        <w:rPr>
-          <w:lang w:val="en"/>
-        </w:rPr>
-        <w:t>AND ?</w:t>
-      </w:r>
-      <w:proofErr w:type="gramEnd"/>
-      <w:r>
-        <w:rPr>
-          <w:lang w:val="en"/>
-        </w:rPr>
-        <w:t xml:space="preserve"> &gt; </w:t>
+        <w:t xml:space="preserve"> AND ? &gt; </w:t>
       </w:r>
       <w:proofErr w:type="spellStart"/>
       <w:r>
@@ -21277,28 +20887,14 @@
         <w:rPr>
           <w:lang w:val="en"/>
         </w:rPr>
-        <w:t>booking_</w:t>
-      </w:r>
-      <w:proofErr w:type="gramStart"/>
-      <w:r>
-        <w:rPr>
-          <w:lang w:val="en"/>
-        </w:rPr>
-        <w:t>id</w:t>
+        <w:t>booking_id</w:t>
       </w:r>
       <w:proofErr w:type="spellEnd"/>
       <w:r>
         <w:rPr>
           <w:lang w:val="en"/>
         </w:rPr>
-        <w:t xml:space="preserve"> !</w:t>
-      </w:r>
-      <w:proofErr w:type="gramEnd"/>
-      <w:r>
-        <w:rPr>
-          <w:lang w:val="en"/>
-        </w:rPr>
-        <w:t>= ?); -- Exclude current booking during rescheduling</w:t>
+        <w:t xml:space="preserve"> != ?); -- Exclude current booking during rescheduling</w:t>
       </w:r>
     </w:p>
     <w:p>
@@ -21453,7 +21049,6 @@
           <w:szCs w:val="22"/>
           <w:lang w:val="en"/>
         </w:rPr>
-        <w:lastRenderedPageBreak/>
         <w:t xml:space="preserve">If matching records exist where </w:t>
       </w:r>
       <w:proofErr w:type="spellStart"/>
@@ -21646,7 +21241,6 @@
         <w:t xml:space="preserve"> Passwords are digested using NIST FIPS 180-4 compliant SHA-256. The resulting 32-byte binary digest is converted to Base64 before storage in </w:t>
       </w:r>
       <w:proofErr w:type="spellStart"/>
-      <w:proofErr w:type="gramStart"/>
       <w:r>
         <w:rPr>
           <w:rStyle w:val="HTMLCode"/>
@@ -21655,7 +21249,6 @@
         <w:t>users.password</w:t>
       </w:r>
       <w:proofErr w:type="spellEnd"/>
-      <w:proofErr w:type="gramEnd"/>
       <w:r>
         <w:rPr>
           <w:rFonts w:ascii="Calibri" w:eastAsia="Times New Roman" w:hAnsi="Calibri" w:cs="Calibri"/>
@@ -22077,6 +21670,7 @@
           <w:rFonts w:eastAsia="Times New Roman"/>
           <w:lang w:val="en"/>
         </w:rPr>
+        <w:lastRenderedPageBreak/>
         <w:t>5. Specific Functional Requirements (Modules 1 to 8)</w:t>
       </w:r>
       <w:bookmarkEnd w:id="35"/>
@@ -22111,10 +21705,10 @@
         <w:tblLook w:val="04A0" w:firstRow="1" w:lastRow="0" w:firstColumn="1" w:lastColumn="0" w:noHBand="0" w:noVBand="1"/>
       </w:tblPr>
       <w:tblGrid>
-        <w:gridCol w:w="1308"/>
-        <w:gridCol w:w="2243"/>
-        <w:gridCol w:w="1121"/>
-        <w:gridCol w:w="4672"/>
+        <w:gridCol w:w="1463"/>
+        <w:gridCol w:w="2508"/>
+        <w:gridCol w:w="1254"/>
+        <w:gridCol w:w="5225"/>
       </w:tblGrid>
       <w:tr>
         <w:trPr>
@@ -22495,7 +22089,6 @@
                 <w:sz w:val="19"/>
                 <w:szCs w:val="19"/>
               </w:rPr>
-              <w:lastRenderedPageBreak/>
               <w:t>FR-AUTH-02</w:t>
             </w:r>
           </w:p>
@@ -23381,47 +22974,7 @@
                 <w:sz w:val="19"/>
                 <w:szCs w:val="19"/>
               </w:rPr>
-              <w:t xml:space="preserve">The </w:t>
-            </w:r>
-            <w:proofErr w:type="gramStart"/>
-            <w:r>
-              <w:rPr>
-                <w:rFonts w:ascii="Calibri" w:eastAsia="Times New Roman" w:hAnsi="Calibri" w:cs="Calibri"/>
-                <w:color w:val="1E293B"/>
-                <w:sz w:val="19"/>
-                <w:szCs w:val="19"/>
-              </w:rPr>
-              <w:t>system shall</w:t>
-            </w:r>
-            <w:proofErr w:type="gramEnd"/>
-            <w:r>
-              <w:rPr>
-                <w:rFonts w:ascii="Calibri" w:eastAsia="Times New Roman" w:hAnsi="Calibri" w:cs="Calibri"/>
-                <w:color w:val="1E293B"/>
-                <w:sz w:val="19"/>
-                <w:szCs w:val="19"/>
-              </w:rPr>
-              <w:t xml:space="preserve"> allow users to log out, terminating the active dashboard window and </w:t>
-            </w:r>
-            <w:proofErr w:type="gramStart"/>
-            <w:r>
-              <w:rPr>
-                <w:rFonts w:ascii="Calibri" w:eastAsia="Times New Roman" w:hAnsi="Calibri" w:cs="Calibri"/>
-                <w:color w:val="1E293B"/>
-                <w:sz w:val="19"/>
-                <w:szCs w:val="19"/>
-              </w:rPr>
-              <w:t>returning</w:t>
-            </w:r>
-            <w:proofErr w:type="gramEnd"/>
-            <w:r>
-              <w:rPr>
-                <w:rFonts w:ascii="Calibri" w:eastAsia="Times New Roman" w:hAnsi="Calibri" w:cs="Calibri"/>
-                <w:color w:val="1E293B"/>
-                <w:sz w:val="19"/>
-                <w:szCs w:val="19"/>
-              </w:rPr>
-              <w:t xml:space="preserve"> to the clean login screen.</w:t>
+              <w:t>The system shall allow users to log out, terminating the active dashboard window and returning to the clean login screen.</w:t>
             </w:r>
           </w:p>
         </w:tc>
@@ -23457,10 +23010,10 @@
         <w:tblLook w:val="04A0" w:firstRow="1" w:lastRow="0" w:firstColumn="1" w:lastColumn="0" w:noHBand="0" w:noVBand="1"/>
       </w:tblPr>
       <w:tblGrid>
-        <w:gridCol w:w="1308"/>
-        <w:gridCol w:w="2243"/>
-        <w:gridCol w:w="1121"/>
-        <w:gridCol w:w="4672"/>
+        <w:gridCol w:w="1463"/>
+        <w:gridCol w:w="2508"/>
+        <w:gridCol w:w="1254"/>
+        <w:gridCol w:w="5225"/>
       </w:tblGrid>
       <w:tr>
         <w:trPr>
@@ -23788,42 +23341,26 @@
               </w:rPr>
               <w:t xml:space="preserve">The dashboard shall execute </w:t>
             </w:r>
-            <w:proofErr w:type="gramStart"/>
             <w:r>
               <w:rPr>
                 <w:rStyle w:val="HTMLCode"/>
               </w:rPr>
-              <w:t>COUNT(</w:t>
-            </w:r>
-            <w:proofErr w:type="gramEnd"/>
+              <w:t>COUNT(*)</w:t>
+            </w:r>
+            <w:r>
+              <w:rPr>
+                <w:rFonts w:ascii="Calibri" w:eastAsia="Times New Roman" w:hAnsi="Calibri" w:cs="Calibri"/>
+                <w:color w:val="1E293B"/>
+                <w:sz w:val="19"/>
+                <w:szCs w:val="19"/>
+              </w:rPr>
+              <w:t xml:space="preserve"> and </w:t>
+            </w:r>
             <w:r>
               <w:rPr>
                 <w:rStyle w:val="HTMLCode"/>
               </w:rPr>
-              <w:t>*)</w:t>
-            </w:r>
-            <w:r>
-              <w:rPr>
-                <w:rFonts w:ascii="Calibri" w:eastAsia="Times New Roman" w:hAnsi="Calibri" w:cs="Calibri"/>
-                <w:color w:val="1E293B"/>
-                <w:sz w:val="19"/>
-                <w:szCs w:val="19"/>
-              </w:rPr>
-              <w:t xml:space="preserve"> and </w:t>
-            </w:r>
-            <w:proofErr w:type="gramStart"/>
-            <w:r>
-              <w:rPr>
-                <w:rStyle w:val="HTMLCode"/>
-              </w:rPr>
-              <w:t>SUM(</w:t>
-            </w:r>
-            <w:proofErr w:type="gramEnd"/>
-            <w:r>
-              <w:rPr>
-                <w:rStyle w:val="HTMLCode"/>
-              </w:rPr>
-              <w:t>status='Active Learner')</w:t>
+              <w:t>SUM(status='Active Learner')</w:t>
             </w:r>
             <w:r>
               <w:rPr>
@@ -24014,21 +23551,7 @@
               <w:rPr>
                 <w:rStyle w:val="HTMLCode"/>
               </w:rPr>
-              <w:t xml:space="preserve"> = CURRENT_</w:t>
-            </w:r>
-            <w:proofErr w:type="gramStart"/>
-            <w:r>
-              <w:rPr>
-                <w:rStyle w:val="HTMLCode"/>
-              </w:rPr>
-              <w:t>DATE(</w:t>
-            </w:r>
-            <w:proofErr w:type="gramEnd"/>
-            <w:r>
-              <w:rPr>
-                <w:rStyle w:val="HTMLCode"/>
-              </w:rPr>
-              <w:t>)</w:t>
+              <w:t xml:space="preserve"> = CURRENT_DATE()</w:t>
             </w:r>
             <w:r>
               <w:rPr>
@@ -24189,27 +23712,7 @@
                 <w:sz w:val="19"/>
                 <w:szCs w:val="19"/>
               </w:rPr>
-              <w:t xml:space="preserve">The dashboard shall query total instructors vs. </w:t>
-            </w:r>
-            <w:proofErr w:type="gramStart"/>
-            <w:r>
-              <w:rPr>
-                <w:rFonts w:ascii="Calibri" w:eastAsia="Times New Roman" w:hAnsi="Calibri" w:cs="Calibri"/>
-                <w:color w:val="1E293B"/>
-                <w:sz w:val="19"/>
-                <w:szCs w:val="19"/>
-              </w:rPr>
-              <w:t>active on</w:t>
-            </w:r>
-            <w:proofErr w:type="gramEnd"/>
-            <w:r>
-              <w:rPr>
-                <w:rFonts w:ascii="Calibri" w:eastAsia="Times New Roman" w:hAnsi="Calibri" w:cs="Calibri"/>
-                <w:color w:val="1E293B"/>
-                <w:sz w:val="19"/>
-                <w:szCs w:val="19"/>
-              </w:rPr>
-              <w:t xml:space="preserve"> duty (</w:t>
+              <w:t>The dashboard shall query total instructors vs. active on duty (</w:t>
             </w:r>
             <w:r>
               <w:rPr>
@@ -24442,10 +23945,10 @@
         <w:tblLook w:val="04A0" w:firstRow="1" w:lastRow="0" w:firstColumn="1" w:lastColumn="0" w:noHBand="0" w:noVBand="1"/>
       </w:tblPr>
       <w:tblGrid>
-        <w:gridCol w:w="1308"/>
-        <w:gridCol w:w="2243"/>
-        <w:gridCol w:w="1121"/>
-        <w:gridCol w:w="4672"/>
+        <w:gridCol w:w="1463"/>
+        <w:gridCol w:w="2508"/>
+        <w:gridCol w:w="1254"/>
+        <w:gridCol w:w="5225"/>
       </w:tblGrid>
       <w:tr>
         <w:trPr>
@@ -24940,7 +24443,6 @@
               </w:rPr>
               <w:t xml:space="preserve">The system shall compute </w:t>
             </w:r>
-            <w:proofErr w:type="gramStart"/>
             <w:r>
               <w:rPr>
                 <w:rStyle w:val="HTMLCode"/>
@@ -24948,33 +24450,18 @@
               <w:t>MAX(</w:t>
             </w:r>
             <w:proofErr w:type="spellStart"/>
-            <w:proofErr w:type="gramEnd"/>
             <w:r>
               <w:rPr>
                 <w:rStyle w:val="HTMLCode"/>
               </w:rPr>
-              <w:t>student_</w:t>
-            </w:r>
-            <w:proofErr w:type="gramStart"/>
+              <w:t>student_id</w:t>
+            </w:r>
+            <w:proofErr w:type="spellEnd"/>
             <w:r>
               <w:rPr>
                 <w:rStyle w:val="HTMLCode"/>
               </w:rPr>
-              <w:t>id</w:t>
-            </w:r>
-            <w:proofErr w:type="spellEnd"/>
-            <w:r>
-              <w:rPr>
-                <w:rStyle w:val="HTMLCode"/>
-              </w:rPr>
-              <w:t>)+</w:t>
-            </w:r>
-            <w:proofErr w:type="gramEnd"/>
-            <w:r>
-              <w:rPr>
-                <w:rStyle w:val="HTMLCode"/>
-              </w:rPr>
-              <w:t>1</w:t>
+              <w:t>)+1</w:t>
             </w:r>
             <w:r>
               <w:rPr>
@@ -25205,7 +24692,6 @@
                 <w:sz w:val="19"/>
                 <w:szCs w:val="19"/>
               </w:rPr>
-              <w:lastRenderedPageBreak/>
               <w:t>FR-STU-04</w:t>
             </w:r>
           </w:p>
@@ -25490,6 +24976,7 @@
           <w:rFonts w:eastAsia="Times New Roman"/>
           <w:lang w:val="en"/>
         </w:rPr>
+        <w:lastRenderedPageBreak/>
         <w:t>5.4 Module 4: Instructor Directory &amp; Allocation</w:t>
       </w:r>
       <w:bookmarkEnd w:id="39"/>
@@ -25506,10 +24993,10 @@
         <w:tblLook w:val="04A0" w:firstRow="1" w:lastRow="0" w:firstColumn="1" w:lastColumn="0" w:noHBand="0" w:noVBand="1"/>
       </w:tblPr>
       <w:tblGrid>
-        <w:gridCol w:w="1308"/>
-        <w:gridCol w:w="2243"/>
-        <w:gridCol w:w="1121"/>
-        <w:gridCol w:w="4672"/>
+        <w:gridCol w:w="1463"/>
+        <w:gridCol w:w="2508"/>
+        <w:gridCol w:w="1254"/>
+        <w:gridCol w:w="5225"/>
       </w:tblGrid>
       <w:tr>
         <w:trPr>
@@ -26371,7 +25858,6 @@
           <w:rFonts w:eastAsia="Times New Roman"/>
           <w:lang w:val="en"/>
         </w:rPr>
-        <w:lastRenderedPageBreak/>
         <w:t>5.5 Module 5: Vehicle Fleet &amp; Maintenance Management</w:t>
       </w:r>
       <w:bookmarkEnd w:id="40"/>
@@ -26388,10 +25874,10 @@
         <w:tblLook w:val="04A0" w:firstRow="1" w:lastRow="0" w:firstColumn="1" w:lastColumn="0" w:noHBand="0" w:noVBand="1"/>
       </w:tblPr>
       <w:tblGrid>
-        <w:gridCol w:w="1308"/>
-        <w:gridCol w:w="2243"/>
-        <w:gridCol w:w="1121"/>
-        <w:gridCol w:w="4672"/>
+        <w:gridCol w:w="1463"/>
+        <w:gridCol w:w="2508"/>
+        <w:gridCol w:w="1254"/>
+        <w:gridCol w:w="5225"/>
       </w:tblGrid>
       <w:tr>
         <w:trPr>
@@ -27238,6 +26724,7 @@
           <w:rFonts w:eastAsia="Times New Roman"/>
           <w:lang w:val="en"/>
         </w:rPr>
+        <w:lastRenderedPageBreak/>
         <w:t>5.6 Module 6: Practical Driving Session Booking &amp; Scheduling</w:t>
       </w:r>
       <w:bookmarkEnd w:id="41"/>
@@ -27254,10 +26741,10 @@
         <w:tblLook w:val="04A0" w:firstRow="1" w:lastRow="0" w:firstColumn="1" w:lastColumn="0" w:noHBand="0" w:noVBand="1"/>
       </w:tblPr>
       <w:tblGrid>
-        <w:gridCol w:w="1308"/>
-        <w:gridCol w:w="2243"/>
-        <w:gridCol w:w="1121"/>
-        <w:gridCol w:w="4672"/>
+        <w:gridCol w:w="1463"/>
+        <w:gridCol w:w="2508"/>
+        <w:gridCol w:w="1254"/>
+        <w:gridCol w:w="5225"/>
       </w:tblGrid>
       <w:tr>
         <w:trPr>
@@ -27583,27 +27070,7 @@
                 <w:sz w:val="19"/>
                 <w:szCs w:val="19"/>
               </w:rPr>
-              <w:t xml:space="preserve">Staff shall schedule practical lessons by selecting </w:t>
-            </w:r>
-            <w:proofErr w:type="gramStart"/>
-            <w:r>
-              <w:rPr>
-                <w:rFonts w:ascii="Calibri" w:eastAsia="Times New Roman" w:hAnsi="Calibri" w:cs="Calibri"/>
-                <w:color w:val="1E293B"/>
-                <w:sz w:val="19"/>
-                <w:szCs w:val="19"/>
-              </w:rPr>
-              <w:t>student</w:t>
-            </w:r>
-            <w:proofErr w:type="gramEnd"/>
-            <w:r>
-              <w:rPr>
-                <w:rFonts w:ascii="Calibri" w:eastAsia="Times New Roman" w:hAnsi="Calibri" w:cs="Calibri"/>
-                <w:color w:val="1E293B"/>
-                <w:sz w:val="19"/>
-                <w:szCs w:val="19"/>
-              </w:rPr>
-              <w:t>, instructor, vehicle, date, start time, and end time.</w:t>
+              <w:t>Staff shall schedule practical lessons by selecting student, instructor, vehicle, date, start time, and end time.</w:t>
             </w:r>
           </w:p>
         </w:tc>
@@ -27829,7 +27296,6 @@
                 <w:sz w:val="19"/>
                 <w:szCs w:val="19"/>
               </w:rPr>
-              <w:lastRenderedPageBreak/>
               <w:t>FR-BK-03</w:t>
             </w:r>
           </w:p>
@@ -28342,10 +27808,10 @@
         <w:tblLook w:val="04A0" w:firstRow="1" w:lastRow="0" w:firstColumn="1" w:lastColumn="0" w:noHBand="0" w:noVBand="1"/>
       </w:tblPr>
       <w:tblGrid>
-        <w:gridCol w:w="1308"/>
-        <w:gridCol w:w="2243"/>
-        <w:gridCol w:w="1121"/>
-        <w:gridCol w:w="4672"/>
+        <w:gridCol w:w="1463"/>
+        <w:gridCol w:w="2508"/>
+        <w:gridCol w:w="1254"/>
+        <w:gridCol w:w="5225"/>
       </w:tblGrid>
       <w:tr>
         <w:trPr>
@@ -29027,10 +28493,10 @@
         <w:tblLook w:val="04A0" w:firstRow="1" w:lastRow="0" w:firstColumn="1" w:lastColumn="0" w:noHBand="0" w:noVBand="1"/>
       </w:tblPr>
       <w:tblGrid>
-        <w:gridCol w:w="1308"/>
-        <w:gridCol w:w="2243"/>
-        <w:gridCol w:w="1121"/>
-        <w:gridCol w:w="4672"/>
+        <w:gridCol w:w="1463"/>
+        <w:gridCol w:w="2508"/>
+        <w:gridCol w:w="1254"/>
+        <w:gridCol w:w="5225"/>
       </w:tblGrid>
       <w:tr>
         <w:trPr>
@@ -29910,27 +29376,7 @@
                 <w:sz w:val="19"/>
                 <w:szCs w:val="19"/>
               </w:rPr>
-              <w:t xml:space="preserve">The system </w:t>
-            </w:r>
-            <w:proofErr w:type="gramStart"/>
-            <w:r>
-              <w:rPr>
-                <w:rFonts w:ascii="Calibri" w:eastAsia="Times New Roman" w:hAnsi="Calibri" w:cs="Calibri"/>
-                <w:color w:val="1E293B"/>
-                <w:sz w:val="19"/>
-                <w:szCs w:val="19"/>
-              </w:rPr>
-              <w:t>shall</w:t>
-            </w:r>
-            <w:proofErr w:type="gramEnd"/>
-            <w:r>
-              <w:rPr>
-                <w:rFonts w:ascii="Calibri" w:eastAsia="Times New Roman" w:hAnsi="Calibri" w:cs="Calibri"/>
-                <w:color w:val="1E293B"/>
-                <w:sz w:val="19"/>
-                <w:szCs w:val="19"/>
-              </w:rPr>
-              <w:t xml:space="preserve"> provide </w:t>
+              <w:t xml:space="preserve">The system shall provide </w:t>
             </w:r>
             <w:proofErr w:type="spellStart"/>
             <w:r>
@@ -29977,7 +29423,6 @@
               <w:t>user_id</w:t>
             </w:r>
             <w:proofErr w:type="spellEnd"/>
-            <w:proofErr w:type="gramStart"/>
             <w:r>
               <w:rPr>
                 <w:rStyle w:val="HTMLCode"/>
@@ -29991,17 +29436,7 @@
                 <w:sz w:val="19"/>
                 <w:szCs w:val="19"/>
               </w:rPr>
-              <w:t>,</w:t>
-            </w:r>
-            <w:proofErr w:type="gramEnd"/>
-            <w:r>
-              <w:rPr>
-                <w:rFonts w:ascii="Calibri" w:eastAsia="Times New Roman" w:hAnsi="Calibri" w:cs="Calibri"/>
-                <w:color w:val="1E293B"/>
-                <w:sz w:val="19"/>
-                <w:szCs w:val="19"/>
-              </w:rPr>
-              <w:t xml:space="preserve"> and reload table.</w:t>
+              <w:t>, and reload table.</w:t>
             </w:r>
           </w:p>
         </w:tc>
@@ -30224,7 +29659,6 @@
               <w:t>) shall be hidden by default (</w:t>
             </w:r>
             <w:proofErr w:type="spellStart"/>
-            <w:proofErr w:type="gramStart"/>
             <w:r>
               <w:rPr>
                 <w:rStyle w:val="HTMLCode"/>
@@ -30236,14 +29670,7 @@
               <w:rPr>
                 <w:rStyle w:val="HTMLCode"/>
               </w:rPr>
-              <w:t>(</w:t>
-            </w:r>
-            <w:proofErr w:type="gramEnd"/>
-            <w:r>
-              <w:rPr>
-                <w:rStyle w:val="HTMLCode"/>
-              </w:rPr>
-              <w:t>)</w:t>
+              <w:t>()</w:t>
             </w:r>
             <w:r>
               <w:rPr>
@@ -30439,7 +29866,6 @@
           <w:rFonts w:eastAsia="Times New Roman"/>
           <w:lang w:val="en"/>
         </w:rPr>
-        <w:lastRenderedPageBreak/>
         <w:t>6. External Interface Requirements</w:t>
       </w:r>
       <w:bookmarkEnd w:id="44"/>
@@ -30733,66 +30159,31 @@
           <w:szCs w:val="22"/>
           <w:lang w:val="en"/>
         </w:rPr>
-        <w:t xml:space="preserve">Primary Brand </w:t>
-      </w:r>
-      <w:proofErr w:type="gramStart"/>
-      <w:r>
-        <w:rPr>
-          <w:rFonts w:ascii="Calibri" w:eastAsia="Times New Roman" w:hAnsi="Calibri" w:cs="Calibri"/>
-          <w:color w:val="1E293B"/>
-          <w:sz w:val="22"/>
-          <w:szCs w:val="22"/>
-          <w:lang w:val="en"/>
-        </w:rPr>
-        <w:t xml:space="preserve">Blue: </w:t>
+        <w:t xml:space="preserve">Primary Brand Blue: </w:t>
       </w:r>
       <w:r>
         <w:rPr>
           <w:rStyle w:val="HTMLCode"/>
           <w:lang w:val="en"/>
         </w:rPr>
-        <w:t>#</w:t>
-      </w:r>
-      <w:proofErr w:type="gramEnd"/>
+        <w:t>#2563eb</w:t>
+      </w:r>
+      <w:r>
+        <w:rPr>
+          <w:rFonts w:ascii="Calibri" w:eastAsia="Times New Roman" w:hAnsi="Calibri" w:cs="Calibri"/>
+          <w:color w:val="1E293B"/>
+          <w:sz w:val="22"/>
+          <w:szCs w:val="22"/>
+          <w:lang w:val="en"/>
+        </w:rPr>
+        <w:t xml:space="preserve"> / </w:t>
+      </w:r>
       <w:r>
         <w:rPr>
           <w:rStyle w:val="HTMLCode"/>
           <w:lang w:val="en"/>
         </w:rPr>
-        <w:t>2563</w:t>
-      </w:r>
-      <w:proofErr w:type="gramStart"/>
-      <w:r>
-        <w:rPr>
-          <w:rStyle w:val="HTMLCode"/>
-          <w:lang w:val="en"/>
-        </w:rPr>
-        <w:t>eb</w:t>
-      </w:r>
-      <w:r>
-        <w:rPr>
-          <w:rFonts w:ascii="Calibri" w:eastAsia="Times New Roman" w:hAnsi="Calibri" w:cs="Calibri"/>
-          <w:color w:val="1E293B"/>
-          <w:sz w:val="22"/>
-          <w:szCs w:val="22"/>
-          <w:lang w:val="en"/>
-        </w:rPr>
-        <w:t xml:space="preserve"> / </w:t>
-      </w:r>
-      <w:r>
-        <w:rPr>
-          <w:rStyle w:val="HTMLCode"/>
-          <w:lang w:val="en"/>
-        </w:rPr>
-        <w:t>#</w:t>
-      </w:r>
-      <w:proofErr w:type="gramEnd"/>
-      <w:r>
-        <w:rPr>
-          <w:rStyle w:val="HTMLCode"/>
-          <w:lang w:val="en"/>
-        </w:rPr>
-        <w:t>1e3a8a</w:t>
+        <w:t>#1e3a8a</w:t>
       </w:r>
     </w:p>
     <w:p>
@@ -30818,33 +30209,14 @@
           <w:szCs w:val="22"/>
           <w:lang w:val="en"/>
         </w:rPr>
-        <w:t xml:space="preserve">Success </w:t>
-      </w:r>
-      <w:proofErr w:type="gramStart"/>
-      <w:r>
-        <w:rPr>
-          <w:rFonts w:ascii="Calibri" w:eastAsia="Times New Roman" w:hAnsi="Calibri" w:cs="Calibri"/>
-          <w:color w:val="1E293B"/>
-          <w:sz w:val="22"/>
-          <w:szCs w:val="22"/>
-          <w:lang w:val="en"/>
-        </w:rPr>
-        <w:t xml:space="preserve">Green: </w:t>
+        <w:t xml:space="preserve">Success Green: </w:t>
       </w:r>
       <w:r>
         <w:rPr>
           <w:rStyle w:val="HTMLCode"/>
           <w:lang w:val="en"/>
         </w:rPr>
-        <w:t>#</w:t>
-      </w:r>
-      <w:proofErr w:type="gramEnd"/>
-      <w:r>
-        <w:rPr>
-          <w:rStyle w:val="HTMLCode"/>
-          <w:lang w:val="en"/>
-        </w:rPr>
-        <w:t>16a34a</w:t>
+        <w:t>#16a34a</w:t>
       </w:r>
     </w:p>
     <w:p>
@@ -30870,33 +30242,14 @@
           <w:szCs w:val="22"/>
           <w:lang w:val="en"/>
         </w:rPr>
-        <w:t xml:space="preserve">Warning / Reset </w:t>
-      </w:r>
-      <w:proofErr w:type="gramStart"/>
-      <w:r>
-        <w:rPr>
-          <w:rFonts w:ascii="Calibri" w:eastAsia="Times New Roman" w:hAnsi="Calibri" w:cs="Calibri"/>
-          <w:color w:val="1E293B"/>
-          <w:sz w:val="22"/>
-          <w:szCs w:val="22"/>
-          <w:lang w:val="en"/>
-        </w:rPr>
-        <w:t xml:space="preserve">Amber: </w:t>
+        <w:t xml:space="preserve">Warning / Reset Amber: </w:t>
       </w:r>
       <w:r>
         <w:rPr>
           <w:rStyle w:val="HTMLCode"/>
           <w:lang w:val="en"/>
         </w:rPr>
-        <w:t>#</w:t>
-      </w:r>
-      <w:proofErr w:type="gramEnd"/>
-      <w:r>
-        <w:rPr>
-          <w:rStyle w:val="HTMLCode"/>
-          <w:lang w:val="en"/>
-        </w:rPr>
-        <w:t>f59e0b</w:t>
+        <w:t>#f59e0b</w:t>
       </w:r>
     </w:p>
     <w:p>
@@ -30922,33 +30275,14 @@
           <w:szCs w:val="22"/>
           <w:lang w:val="en"/>
         </w:rPr>
-        <w:t xml:space="preserve">Danger / Delete </w:t>
-      </w:r>
-      <w:proofErr w:type="gramStart"/>
-      <w:r>
-        <w:rPr>
-          <w:rFonts w:ascii="Calibri" w:eastAsia="Times New Roman" w:hAnsi="Calibri" w:cs="Calibri"/>
-          <w:color w:val="1E293B"/>
-          <w:sz w:val="22"/>
-          <w:szCs w:val="22"/>
-          <w:lang w:val="en"/>
-        </w:rPr>
-        <w:t xml:space="preserve">Crimson: </w:t>
+        <w:t xml:space="preserve">Danger / Delete Crimson: </w:t>
       </w:r>
       <w:r>
         <w:rPr>
           <w:rStyle w:val="HTMLCode"/>
           <w:lang w:val="en"/>
         </w:rPr>
-        <w:t>#</w:t>
-      </w:r>
-      <w:proofErr w:type="gramEnd"/>
-      <w:r>
-        <w:rPr>
-          <w:rStyle w:val="HTMLCode"/>
-          <w:lang w:val="en"/>
-        </w:rPr>
-        <w:t>cc0033</w:t>
+        <w:t>#cc0033</w:t>
       </w:r>
     </w:p>
     <w:p>
@@ -31039,7 +30373,6 @@
         </w:rPr>
       </w:pPr>
       <w:proofErr w:type="spellStart"/>
-      <w:proofErr w:type="gramStart"/>
       <w:r>
         <w:rPr>
           <w:lang w:val="en"/>
@@ -31051,14 +30384,7 @@
         <w:rPr>
           <w:lang w:val="en"/>
         </w:rPr>
-        <w:t>(</w:t>
-      </w:r>
-      <w:proofErr w:type="gramEnd"/>
-      <w:r>
-        <w:rPr>
-          <w:lang w:val="en"/>
-        </w:rPr>
-        <w:t xml:space="preserve">); // </w:t>
+        <w:t xml:space="preserve">(); // </w:t>
       </w:r>
       <w:proofErr w:type="spellStart"/>
       <w:r>
@@ -31467,7 +30793,6 @@
           <w:rFonts w:eastAsia="Times New Roman"/>
           <w:lang w:val="en"/>
         </w:rPr>
-        <w:lastRenderedPageBreak/>
         <w:t>6.3 Software &amp; Driver Interfaces</w:t>
       </w:r>
       <w:bookmarkEnd w:id="47"/>
@@ -31509,37 +30834,12 @@
         <w:t xml:space="preserve"> The application interfaces with MySQL via the official </w:t>
       </w:r>
       <w:proofErr w:type="spellStart"/>
-      <w:proofErr w:type="gramStart"/>
       <w:r>
         <w:rPr>
           <w:rStyle w:val="HTMLCode"/>
           <w:lang w:val="en"/>
         </w:rPr>
-        <w:t>com.mysql</w:t>
-      </w:r>
-      <w:proofErr w:type="gramEnd"/>
-      <w:r>
-        <w:rPr>
-          <w:rStyle w:val="HTMLCode"/>
-          <w:lang w:val="en"/>
-        </w:rPr>
-        <w:t>.</w:t>
-      </w:r>
-      <w:proofErr w:type="gramStart"/>
-      <w:r>
-        <w:rPr>
-          <w:rStyle w:val="HTMLCode"/>
-          <w:lang w:val="en"/>
-        </w:rPr>
-        <w:t>cj.jdbc</w:t>
-      </w:r>
-      <w:proofErr w:type="gramEnd"/>
-      <w:r>
-        <w:rPr>
-          <w:rStyle w:val="HTMLCode"/>
-          <w:lang w:val="en"/>
-        </w:rPr>
-        <w:t>.Driver</w:t>
+        <w:t>com.mysql.cj.jdbc.Driver</w:t>
       </w:r>
       <w:proofErr w:type="spellEnd"/>
       <w:r>
@@ -31620,32 +30920,14 @@
         <w:t xml:space="preserve"> </w:t>
       </w:r>
       <w:proofErr w:type="spellStart"/>
-      <w:proofErr w:type="gramStart"/>
       <w:r>
         <w:rPr>
           <w:rStyle w:val="HTMLCode"/>
           <w:lang w:val="en"/>
         </w:rPr>
-        <w:t>com.formdev</w:t>
-      </w:r>
-      <w:proofErr w:type="gramEnd"/>
-      <w:r>
-        <w:rPr>
-          <w:rStyle w:val="HTMLCode"/>
-          <w:lang w:val="en"/>
-        </w:rPr>
-        <w:t>.</w:t>
-      </w:r>
-      <w:proofErr w:type="gramStart"/>
-      <w:r>
-        <w:rPr>
-          <w:rStyle w:val="HTMLCode"/>
-          <w:lang w:val="en"/>
-        </w:rPr>
-        <w:t>flatlaf.FlatIntelliJLaf</w:t>
+        <w:t>com.formdev.flatlaf.FlatIntelliJLaf</w:t>
       </w:r>
       <w:proofErr w:type="spellEnd"/>
-      <w:proofErr w:type="gramEnd"/>
       <w:r>
         <w:rPr>
           <w:rFonts w:ascii="Calibri" w:eastAsia="Times New Roman" w:hAnsi="Calibri" w:cs="Calibri"/>
@@ -31728,6 +31010,7 @@
           <w:rFonts w:eastAsia="Times New Roman"/>
           <w:lang w:val="en"/>
         </w:rPr>
+        <w:lastRenderedPageBreak/>
         <w:t>7. Non-Functional Requirements (NFR)</w:t>
       </w:r>
       <w:bookmarkEnd w:id="49"/>
@@ -31762,9 +31045,9 @@
         <w:tblLook w:val="04A0" w:firstRow="1" w:lastRow="0" w:firstColumn="1" w:lastColumn="0" w:noHBand="0" w:noVBand="1"/>
       </w:tblPr>
       <w:tblGrid>
-        <w:gridCol w:w="1682"/>
-        <w:gridCol w:w="2336"/>
-        <w:gridCol w:w="5326"/>
+        <w:gridCol w:w="1880"/>
+        <w:gridCol w:w="2613"/>
+        <w:gridCol w:w="5957"/>
       </w:tblGrid>
       <w:tr>
         <w:trPr>
@@ -32265,27 +31548,7 @@
                 <w:sz w:val="19"/>
                 <w:szCs w:val="19"/>
               </w:rPr>
-              <w:t xml:space="preserve">The double-booking conflict detection query shall </w:t>
-            </w:r>
-            <w:proofErr w:type="gramStart"/>
-            <w:r>
-              <w:rPr>
-                <w:rFonts w:ascii="Calibri" w:eastAsia="Times New Roman" w:hAnsi="Calibri" w:cs="Calibri"/>
-                <w:color w:val="1E293B"/>
-                <w:sz w:val="19"/>
-                <w:szCs w:val="19"/>
-              </w:rPr>
-              <w:t>execute</w:t>
-            </w:r>
-            <w:proofErr w:type="gramEnd"/>
-            <w:r>
-              <w:rPr>
-                <w:rFonts w:ascii="Calibri" w:eastAsia="Times New Roman" w:hAnsi="Calibri" w:cs="Calibri"/>
-                <w:color w:val="1E293B"/>
-                <w:sz w:val="19"/>
-                <w:szCs w:val="19"/>
-              </w:rPr>
-              <w:t xml:space="preserve"> in &lt; 150 </w:t>
+              <w:t xml:space="preserve">The double-booking conflict detection query shall execute in &lt; 150 </w:t>
             </w:r>
             <w:proofErr w:type="spellStart"/>
             <w:r>
@@ -32449,7 +31712,6 @@
           <w:rFonts w:eastAsia="Times New Roman"/>
           <w:lang w:val="en"/>
         </w:rPr>
-        <w:lastRenderedPageBreak/>
         <w:t>7.2 Reliability, Availability &amp; Disaster Recovery</w:t>
       </w:r>
       <w:bookmarkEnd w:id="51"/>
@@ -32488,29 +31750,7 @@
           <w:szCs w:val="22"/>
           <w:lang w:val="en"/>
         </w:rPr>
-        <w:t xml:space="preserve"> All booking creations, updates, and user flag resets execute within strict database transaction boundaries. In the event of a runtime SQL exception or network disconnection, uncommitted changes </w:t>
-      </w:r>
-      <w:proofErr w:type="gramStart"/>
-      <w:r>
-        <w:rPr>
-          <w:rFonts w:ascii="Calibri" w:eastAsia="Times New Roman" w:hAnsi="Calibri" w:cs="Calibri"/>
-          <w:color w:val="1E293B"/>
-          <w:sz w:val="22"/>
-          <w:szCs w:val="22"/>
-          <w:lang w:val="en"/>
-        </w:rPr>
-        <w:t>rollback</w:t>
-      </w:r>
-      <w:proofErr w:type="gramEnd"/>
-      <w:r>
-        <w:rPr>
-          <w:rFonts w:ascii="Calibri" w:eastAsia="Times New Roman" w:hAnsi="Calibri" w:cs="Calibri"/>
-          <w:color w:val="1E293B"/>
-          <w:sz w:val="22"/>
-          <w:szCs w:val="22"/>
-          <w:lang w:val="en"/>
-        </w:rPr>
-        <w:t xml:space="preserve"> automatically.</w:t>
+        <w:t xml:space="preserve"> All booking creations, updates, and user flag resets execute within strict database transaction boundaries. In the event of a runtime SQL exception or network disconnection, uncommitted changes rollback automatically.</w:t>
       </w:r>
     </w:p>
     <w:p>
@@ -32550,7 +31790,6 @@
         <w:t xml:space="preserve"> The </w:t>
       </w:r>
       <w:proofErr w:type="spellStart"/>
-      <w:proofErr w:type="gramStart"/>
       <w:r>
         <w:rPr>
           <w:rStyle w:val="HTMLCode"/>
@@ -32564,37 +31803,27 @@
           <w:rStyle w:val="HTMLCode"/>
           <w:lang w:val="en"/>
         </w:rPr>
-        <w:t>(</w:t>
-      </w:r>
-      <w:proofErr w:type="gramEnd"/>
+        <w:t>()</w:t>
+      </w:r>
+      <w:r>
+        <w:rPr>
+          <w:rFonts w:ascii="Calibri" w:eastAsia="Times New Roman" w:hAnsi="Calibri" w:cs="Calibri"/>
+          <w:color w:val="1E293B"/>
+          <w:sz w:val="22"/>
+          <w:szCs w:val="22"/>
+          <w:lang w:val="en"/>
+        </w:rPr>
+        <w:t xml:space="preserve"> helper method checks whether the connection is null or closed (</w:t>
+      </w:r>
+      <w:proofErr w:type="spellStart"/>
       <w:r>
         <w:rPr>
           <w:rStyle w:val="HTMLCode"/>
           <w:lang w:val="en"/>
         </w:rPr>
-        <w:t>)</w:t>
-      </w:r>
-      <w:r>
-        <w:rPr>
-          <w:rFonts w:ascii="Calibri" w:eastAsia="Times New Roman" w:hAnsi="Calibri" w:cs="Calibri"/>
-          <w:color w:val="1E293B"/>
-          <w:sz w:val="22"/>
-          <w:szCs w:val="22"/>
-          <w:lang w:val="en"/>
-        </w:rPr>
-        <w:t xml:space="preserve"> helper method checks whether the connection is null or closed (</w:t>
-      </w:r>
-      <w:proofErr w:type="spellStart"/>
-      <w:proofErr w:type="gramStart"/>
-      <w:r>
-        <w:rPr>
-          <w:rStyle w:val="HTMLCode"/>
-          <w:lang w:val="en"/>
-        </w:rPr>
         <w:t>con.isClosed</w:t>
       </w:r>
       <w:proofErr w:type="spellEnd"/>
-      <w:proofErr w:type="gramEnd"/>
       <w:r>
         <w:rPr>
           <w:rStyle w:val="HTMLCode"/>
@@ -32650,32 +31879,14 @@
         <w:t xml:space="preserve"> All caught runtime errors are logged via standard Java Logging API (</w:t>
       </w:r>
       <w:proofErr w:type="spellStart"/>
-      <w:proofErr w:type="gramStart"/>
       <w:r>
         <w:rPr>
           <w:rStyle w:val="HTMLCode"/>
           <w:lang w:val="en"/>
         </w:rPr>
-        <w:t>java.util</w:t>
-      </w:r>
-      <w:proofErr w:type="gramEnd"/>
-      <w:r>
-        <w:rPr>
-          <w:rStyle w:val="HTMLCode"/>
-          <w:lang w:val="en"/>
-        </w:rPr>
-        <w:t>.</w:t>
-      </w:r>
-      <w:proofErr w:type="gramStart"/>
-      <w:r>
-        <w:rPr>
-          <w:rStyle w:val="HTMLCode"/>
-          <w:lang w:val="en"/>
-        </w:rPr>
-        <w:t>logging.Logger</w:t>
+        <w:t>java.util.logging.Logger</w:t>
       </w:r>
       <w:proofErr w:type="spellEnd"/>
-      <w:proofErr w:type="gramEnd"/>
       <w:r>
         <w:rPr>
           <w:rFonts w:ascii="Calibri" w:eastAsia="Times New Roman" w:hAnsi="Calibri" w:cs="Calibri"/>
@@ -32933,6 +32144,7 @@
           <w:szCs w:val="22"/>
           <w:lang w:val="en"/>
         </w:rPr>
+        <w:lastRenderedPageBreak/>
         <w:t>Maintainability:</w:t>
       </w:r>
       <w:r>
@@ -32943,29 +32155,7 @@
           <w:szCs w:val="22"/>
           <w:lang w:val="en"/>
         </w:rPr>
-        <w:t xml:space="preserve"> Clean source code structure with zero inline </w:t>
-      </w:r>
-      <w:proofErr w:type="gramStart"/>
-      <w:r>
-        <w:rPr>
-          <w:rFonts w:ascii="Calibri" w:eastAsia="Times New Roman" w:hAnsi="Calibri" w:cs="Calibri"/>
-          <w:color w:val="1E293B"/>
-          <w:sz w:val="22"/>
-          <w:szCs w:val="22"/>
-          <w:lang w:val="en"/>
-        </w:rPr>
-        <w:t>fully-qualified</w:t>
-      </w:r>
-      <w:proofErr w:type="gramEnd"/>
-      <w:r>
-        <w:rPr>
-          <w:rFonts w:ascii="Calibri" w:eastAsia="Times New Roman" w:hAnsi="Calibri" w:cs="Calibri"/>
-          <w:color w:val="1E293B"/>
-          <w:sz w:val="22"/>
-          <w:szCs w:val="22"/>
-          <w:lang w:val="en"/>
-        </w:rPr>
-        <w:t xml:space="preserve"> package namespaces (all imports placed at top of files), modular MVC separation, and comprehensive docstrings.</w:t>
+        <w:t xml:space="preserve"> Clean source code structure with zero inline fully-qualified package namespaces (all imports placed at top of files), modular MVC separation, and comprehensive docstrings.</w:t>
       </w:r>
     </w:p>
     <w:p>
@@ -33019,7 +32209,6 @@
           <w:rFonts w:eastAsia="Times New Roman"/>
           <w:lang w:val="en"/>
         </w:rPr>
-        <w:lastRenderedPageBreak/>
         <w:t>8. System Verification, Validation &amp; Test Cases</w:t>
       </w:r>
       <w:bookmarkEnd w:id="54"/>
@@ -33054,10 +32243,10 @@
         <w:tblLook w:val="04A0" w:firstRow="1" w:lastRow="0" w:firstColumn="1" w:lastColumn="0" w:noHBand="0" w:noVBand="1"/>
       </w:tblPr>
       <w:tblGrid>
-        <w:gridCol w:w="1869"/>
-        <w:gridCol w:w="2990"/>
-        <w:gridCol w:w="2616"/>
-        <w:gridCol w:w="1869"/>
+        <w:gridCol w:w="2090"/>
+        <w:gridCol w:w="3344"/>
+        <w:gridCol w:w="2926"/>
+        <w:gridCol w:w="2090"/>
       </w:tblGrid>
       <w:tr>
         <w:trPr>
@@ -33721,21 +32910,7 @@
               <w:rPr>
                 <w:rStyle w:val="HTMLCode"/>
               </w:rPr>
-              <w:t>FR-DASH-</w:t>
-            </w:r>
-            <w:proofErr w:type="gramStart"/>
-            <w:r>
-              <w:rPr>
-                <w:rStyle w:val="HTMLCode"/>
-              </w:rPr>
-              <w:t>01..</w:t>
-            </w:r>
-            <w:proofErr w:type="gramEnd"/>
-            <w:r>
-              <w:rPr>
-                <w:rStyle w:val="HTMLCode"/>
-              </w:rPr>
-              <w:t>04</w:t>
+              <w:t>FR-DASH-01..04</w:t>
             </w:r>
           </w:p>
         </w:tc>
@@ -33881,21 +33056,7 @@
               <w:rPr>
                 <w:rStyle w:val="HTMLCode"/>
               </w:rPr>
-              <w:t>FR-STU-</w:t>
-            </w:r>
-            <w:proofErr w:type="gramStart"/>
-            <w:r>
-              <w:rPr>
-                <w:rStyle w:val="HTMLCode"/>
-              </w:rPr>
-              <w:t>01..</w:t>
-            </w:r>
-            <w:proofErr w:type="gramEnd"/>
-            <w:r>
-              <w:rPr>
-                <w:rStyle w:val="HTMLCode"/>
-              </w:rPr>
-              <w:t>05</w:t>
+              <w:t>FR-STU-01..05</w:t>
             </w:r>
           </w:p>
         </w:tc>
@@ -34056,21 +33217,7 @@
               <w:rPr>
                 <w:rStyle w:val="HTMLCode"/>
               </w:rPr>
-              <w:t>FR-BK-</w:t>
-            </w:r>
-            <w:proofErr w:type="gramStart"/>
-            <w:r>
-              <w:rPr>
-                <w:rStyle w:val="HTMLCode"/>
-              </w:rPr>
-              <w:t>01..</w:t>
-            </w:r>
-            <w:proofErr w:type="gramEnd"/>
-            <w:r>
-              <w:rPr>
-                <w:rStyle w:val="HTMLCode"/>
-              </w:rPr>
-              <w:t>03</w:t>
+              <w:t>FR-BK-01..03</w:t>
             </w:r>
           </w:p>
         </w:tc>
@@ -34448,29 +33595,7 @@
           <w:szCs w:val="22"/>
           <w:lang w:val="en"/>
         </w:rPr>
-        <w:t xml:space="preserve"> Database contains active user </w:t>
-      </w:r>
-      <w:proofErr w:type="gramStart"/>
-      <w:r>
-        <w:rPr>
-          <w:rFonts w:ascii="Calibri" w:eastAsia="Times New Roman" w:hAnsi="Calibri" w:cs="Calibri"/>
-          <w:color w:val="1E293B"/>
-          <w:sz w:val="22"/>
-          <w:szCs w:val="22"/>
-          <w:lang w:val="en"/>
-        </w:rPr>
-        <w:t>account</w:t>
-      </w:r>
-      <w:proofErr w:type="gramEnd"/>
-      <w:r>
-        <w:rPr>
-          <w:rFonts w:ascii="Calibri" w:eastAsia="Times New Roman" w:hAnsi="Calibri" w:cs="Calibri"/>
-          <w:color w:val="1E293B"/>
-          <w:sz w:val="22"/>
-          <w:szCs w:val="22"/>
-          <w:lang w:val="en"/>
-        </w:rPr>
-        <w:t xml:space="preserve"> (</w:t>
+        <w:t xml:space="preserve"> Database contains active user account (</w:t>
       </w:r>
       <w:r>
         <w:rPr>
@@ -34531,7 +33656,6 @@
           <w:szCs w:val="22"/>
           <w:lang w:val="en"/>
         </w:rPr>
-        <w:lastRenderedPageBreak/>
         <w:t>Test Input:</w:t>
       </w:r>
       <w:r>
@@ -34685,6 +33809,7 @@
           <w:rFonts w:eastAsia="Times New Roman"/>
           <w:lang w:val="en"/>
         </w:rPr>
+        <w:lastRenderedPageBreak/>
         <w:t>Test Case TC-AUTH-03: First-Time Login Mandatory Password Change</w:t>
       </w:r>
       <w:bookmarkEnd w:id="58"/>
@@ -35443,58 +34568,24 @@
           <w:rStyle w:val="HTMLCode"/>
           <w:lang w:val="en"/>
         </w:rPr>
-        <w:t>^([0-9]{</w:t>
-      </w:r>
-      <w:proofErr w:type="gramStart"/>
+        <w:t>^([0-9]{9}[</w:t>
+      </w:r>
+      <w:proofErr w:type="spellStart"/>
       <w:r>
         <w:rPr>
           <w:rStyle w:val="HTMLCode"/>
           <w:lang w:val="en"/>
         </w:rPr>
-        <w:t>9}[</w:t>
-      </w:r>
-      <w:proofErr w:type="spellStart"/>
-      <w:proofErr w:type="gramEnd"/>
+        <w:t>vVxX</w:t>
+      </w:r>
+      <w:proofErr w:type="spellEnd"/>
       <w:r>
         <w:rPr>
           <w:rStyle w:val="HTMLCode"/>
           <w:lang w:val="en"/>
         </w:rPr>
-        <w:t>vVxX</w:t>
-      </w:r>
-      <w:proofErr w:type="spellEnd"/>
-      <w:r>
-        <w:rPr>
-          <w:rStyle w:val="HTMLCode"/>
-          <w:lang w:val="en"/>
-        </w:rPr>
-        <w:t>]</w:t>
-      </w:r>
-      <w:proofErr w:type="gramStart"/>
-      <w:r>
-        <w:rPr>
-          <w:rStyle w:val="HTMLCode"/>
-          <w:lang w:val="en"/>
-        </w:rPr>
-        <w:t>|[</w:t>
-      </w:r>
-      <w:proofErr w:type="gramEnd"/>
-      <w:r>
-        <w:rPr>
-          <w:rStyle w:val="HTMLCode"/>
-          <w:lang w:val="en"/>
-        </w:rPr>
-        <w:t>0-9]{12</w:t>
-      </w:r>
-      <w:proofErr w:type="gramStart"/>
-      <w:r>
-        <w:rPr>
-          <w:rStyle w:val="HTMLCode"/>
-          <w:lang w:val="en"/>
-        </w:rPr>
-        <w:t>})$</w:t>
-      </w:r>
-      <w:proofErr w:type="gramEnd"/>
+        <w:t>]|[0-9]{12})$</w:t>
+      </w:r>
       <w:r>
         <w:rPr>
           <w:rFonts w:ascii="Calibri" w:eastAsia="Times New Roman" w:hAnsi="Calibri" w:cs="Calibri"/>
@@ -35861,7 +34952,6 @@
         <w:t xml:space="preserve"> checkbox, refreshes table, clears form, and hides action buttons via </w:t>
       </w:r>
       <w:proofErr w:type="spellStart"/>
-      <w:proofErr w:type="gramStart"/>
       <w:r>
         <w:rPr>
           <w:rStyle w:val="HTMLCode"/>
@@ -35875,15 +34965,7 @@
           <w:rStyle w:val="HTMLCode"/>
           <w:lang w:val="en"/>
         </w:rPr>
-        <w:t>(</w:t>
-      </w:r>
-      <w:proofErr w:type="gramEnd"/>
-      <w:r>
-        <w:rPr>
-          <w:rStyle w:val="HTMLCode"/>
-          <w:lang w:val="en"/>
-        </w:rPr>
-        <w:t>)</w:t>
+        <w:t>()</w:t>
       </w:r>
       <w:r>
         <w:rPr>
@@ -35965,7 +35047,6 @@
           <w:rFonts w:eastAsia="Times New Roman"/>
           <w:lang w:val="en"/>
         </w:rPr>
-        <w:lastRenderedPageBreak/>
         <w:t>9. Appendices &amp; Glossary</w:t>
       </w:r>
       <w:bookmarkEnd w:id="62"/>
@@ -35990,7 +35071,7 @@
     </w:p>
     <w:tbl>
       <w:tblPr>
-        <w:tblW w:w="5000" w:type="pct"/>
+        <w:tblW w:w="5171" w:type="pct"/>
         <w:tblCellMar>
           <w:top w:w="15" w:type="dxa"/>
           <w:left w:w="15" w:type="dxa"/>
@@ -36000,11 +35081,12 @@
         <w:tblLook w:val="04A0" w:firstRow="1" w:lastRow="0" w:firstColumn="1" w:lastColumn="0" w:noHBand="0" w:noVBand="1"/>
       </w:tblPr>
       <w:tblGrid>
-        <w:gridCol w:w="2056"/>
-        <w:gridCol w:w="7288"/>
+        <w:gridCol w:w="2378"/>
+        <w:gridCol w:w="8429"/>
       </w:tblGrid>
       <w:tr>
         <w:trPr>
+          <w:trHeight w:val="540"/>
           <w:tblHeader/>
         </w:trPr>
         <w:tc>
@@ -36095,26 +35177,29 @@
         </w:tc>
       </w:tr>
       <w:tr>
-        <w:tc>
-          <w:tcPr>
-            <w:tcW w:w="0" w:type="auto"/>
-            <w:tcBorders>
-              <w:top w:val="single" w:sz="6" w:space="0" w:color="CBD5E1"/>
-              <w:left w:val="single" w:sz="6" w:space="0" w:color="CBD5E1"/>
-              <w:bottom w:val="single" w:sz="6" w:space="0" w:color="CBD5E1"/>
-              <w:right w:val="single" w:sz="6" w:space="0" w:color="CBD5E1"/>
-            </w:tcBorders>
-            <w:tcMar>
-              <w:top w:w="120" w:type="dxa"/>
-              <w:left w:w="160" w:type="dxa"/>
-              <w:bottom w:w="120" w:type="dxa"/>
-              <w:right w:w="160" w:type="dxa"/>
-            </w:tcMar>
-            <w:hideMark/>
-          </w:tcPr>
-          <w:p>
-            <w:pPr>
-              <w:spacing w:before="200" w:after="280"/>
+        <w:trPr>
+          <w:trHeight w:val="725"/>
+        </w:trPr>
+        <w:tc>
+          <w:tcPr>
+            <w:tcW w:w="0" w:type="auto"/>
+            <w:tcBorders>
+              <w:top w:val="single" w:sz="6" w:space="0" w:color="CBD5E1"/>
+              <w:left w:val="single" w:sz="6" w:space="0" w:color="CBD5E1"/>
+              <w:bottom w:val="single" w:sz="6" w:space="0" w:color="CBD5E1"/>
+              <w:right w:val="single" w:sz="6" w:space="0" w:color="CBD5E1"/>
+            </w:tcBorders>
+            <w:tcMar>
+              <w:top w:w="120" w:type="dxa"/>
+              <w:left w:w="160" w:type="dxa"/>
+              <w:bottom w:w="120" w:type="dxa"/>
+              <w:right w:w="160" w:type="dxa"/>
+            </w:tcMar>
+            <w:hideMark/>
+          </w:tcPr>
+          <w:p>
+            <w:pPr>
+              <w:spacing w:after="280"/>
               <w:rPr>
                 <w:rFonts w:ascii="Calibri" w:eastAsia="Times New Roman" w:hAnsi="Calibri" w:cs="Calibri"/>
                 <w:color w:val="1E293B"/>
@@ -36153,7 +35238,7 @@
           </w:tcPr>
           <w:p>
             <w:pPr>
-              <w:spacing w:before="200" w:after="280"/>
+              <w:spacing w:after="280"/>
               <w:rPr>
                 <w:rFonts w:ascii="Calibri" w:eastAsia="Times New Roman" w:hAnsi="Calibri" w:cs="Calibri"/>
                 <w:color w:val="1E293B"/>
@@ -36184,26 +35269,29 @@
         </w:tc>
       </w:tr>
       <w:tr>
-        <w:tc>
-          <w:tcPr>
-            <w:tcW w:w="0" w:type="auto"/>
-            <w:tcBorders>
-              <w:top w:val="single" w:sz="6" w:space="0" w:color="CBD5E1"/>
-              <w:left w:val="single" w:sz="6" w:space="0" w:color="CBD5E1"/>
-              <w:bottom w:val="single" w:sz="6" w:space="0" w:color="CBD5E1"/>
-              <w:right w:val="single" w:sz="6" w:space="0" w:color="CBD5E1"/>
-            </w:tcBorders>
-            <w:tcMar>
-              <w:top w:w="120" w:type="dxa"/>
-              <w:left w:w="160" w:type="dxa"/>
-              <w:bottom w:w="120" w:type="dxa"/>
-              <w:right w:w="160" w:type="dxa"/>
-            </w:tcMar>
-            <w:hideMark/>
-          </w:tcPr>
-          <w:p>
-            <w:pPr>
-              <w:spacing w:before="200" w:after="280"/>
+        <w:trPr>
+          <w:trHeight w:val="725"/>
+        </w:trPr>
+        <w:tc>
+          <w:tcPr>
+            <w:tcW w:w="0" w:type="auto"/>
+            <w:tcBorders>
+              <w:top w:val="single" w:sz="6" w:space="0" w:color="CBD5E1"/>
+              <w:left w:val="single" w:sz="6" w:space="0" w:color="CBD5E1"/>
+              <w:bottom w:val="single" w:sz="6" w:space="0" w:color="CBD5E1"/>
+              <w:right w:val="single" w:sz="6" w:space="0" w:color="CBD5E1"/>
+            </w:tcBorders>
+            <w:tcMar>
+              <w:top w:w="120" w:type="dxa"/>
+              <w:left w:w="160" w:type="dxa"/>
+              <w:bottom w:w="120" w:type="dxa"/>
+              <w:right w:w="160" w:type="dxa"/>
+            </w:tcMar>
+            <w:hideMark/>
+          </w:tcPr>
+          <w:p>
+            <w:pPr>
+              <w:spacing w:after="280"/>
               <w:rPr>
                 <w:rFonts w:ascii="Calibri" w:eastAsia="Times New Roman" w:hAnsi="Calibri" w:cs="Calibri"/>
                 <w:color w:val="1E293B"/>
@@ -36242,7 +35330,7 @@
           </w:tcPr>
           <w:p>
             <w:pPr>
-              <w:spacing w:before="200" w:after="280"/>
+              <w:spacing w:after="280"/>
               <w:rPr>
                 <w:rFonts w:ascii="Calibri" w:eastAsia="Times New Roman" w:hAnsi="Calibri" w:cs="Calibri"/>
                 <w:color w:val="1E293B"/>
@@ -36273,26 +35361,29 @@
         </w:tc>
       </w:tr>
       <w:tr>
-        <w:tc>
-          <w:tcPr>
-            <w:tcW w:w="0" w:type="auto"/>
-            <w:tcBorders>
-              <w:top w:val="single" w:sz="6" w:space="0" w:color="CBD5E1"/>
-              <w:left w:val="single" w:sz="6" w:space="0" w:color="CBD5E1"/>
-              <w:bottom w:val="single" w:sz="6" w:space="0" w:color="CBD5E1"/>
-              <w:right w:val="single" w:sz="6" w:space="0" w:color="CBD5E1"/>
-            </w:tcBorders>
-            <w:tcMar>
-              <w:top w:w="120" w:type="dxa"/>
-              <w:left w:w="160" w:type="dxa"/>
-              <w:bottom w:w="120" w:type="dxa"/>
-              <w:right w:w="160" w:type="dxa"/>
-            </w:tcMar>
-            <w:hideMark/>
-          </w:tcPr>
-          <w:p>
-            <w:pPr>
-              <w:spacing w:before="200" w:after="280"/>
+        <w:trPr>
+          <w:trHeight w:val="725"/>
+        </w:trPr>
+        <w:tc>
+          <w:tcPr>
+            <w:tcW w:w="0" w:type="auto"/>
+            <w:tcBorders>
+              <w:top w:val="single" w:sz="6" w:space="0" w:color="CBD5E1"/>
+              <w:left w:val="single" w:sz="6" w:space="0" w:color="CBD5E1"/>
+              <w:bottom w:val="single" w:sz="6" w:space="0" w:color="CBD5E1"/>
+              <w:right w:val="single" w:sz="6" w:space="0" w:color="CBD5E1"/>
+            </w:tcBorders>
+            <w:tcMar>
+              <w:top w:w="120" w:type="dxa"/>
+              <w:left w:w="160" w:type="dxa"/>
+              <w:bottom w:w="120" w:type="dxa"/>
+              <w:right w:w="160" w:type="dxa"/>
+            </w:tcMar>
+            <w:hideMark/>
+          </w:tcPr>
+          <w:p>
+            <w:pPr>
+              <w:spacing w:after="280"/>
               <w:rPr>
                 <w:rFonts w:ascii="Calibri" w:eastAsia="Times New Roman" w:hAnsi="Calibri" w:cs="Calibri"/>
                 <w:color w:val="1E293B"/>
@@ -36308,6 +35399,7 @@
                 <w:sz w:val="19"/>
                 <w:szCs w:val="19"/>
               </w:rPr>
+              <w:lastRenderedPageBreak/>
               <w:t>GUI</w:t>
             </w:r>
           </w:p>
@@ -36331,7 +35423,7 @@
           </w:tcPr>
           <w:p>
             <w:pPr>
-              <w:spacing w:before="200" w:after="280"/>
+              <w:spacing w:after="280"/>
               <w:rPr>
                 <w:rFonts w:ascii="Calibri" w:eastAsia="Times New Roman" w:hAnsi="Calibri" w:cs="Calibri"/>
                 <w:color w:val="1E293B"/>
@@ -36362,26 +35454,29 @@
         </w:tc>
       </w:tr>
       <w:tr>
-        <w:tc>
-          <w:tcPr>
-            <w:tcW w:w="0" w:type="auto"/>
-            <w:tcBorders>
-              <w:top w:val="single" w:sz="6" w:space="0" w:color="CBD5E1"/>
-              <w:left w:val="single" w:sz="6" w:space="0" w:color="CBD5E1"/>
-              <w:bottom w:val="single" w:sz="6" w:space="0" w:color="CBD5E1"/>
-              <w:right w:val="single" w:sz="6" w:space="0" w:color="CBD5E1"/>
-            </w:tcBorders>
-            <w:tcMar>
-              <w:top w:w="120" w:type="dxa"/>
-              <w:left w:w="160" w:type="dxa"/>
-              <w:bottom w:w="120" w:type="dxa"/>
-              <w:right w:w="160" w:type="dxa"/>
-            </w:tcMar>
-            <w:hideMark/>
-          </w:tcPr>
-          <w:p>
-            <w:pPr>
-              <w:spacing w:before="200" w:after="280"/>
+        <w:trPr>
+          <w:trHeight w:val="725"/>
+        </w:trPr>
+        <w:tc>
+          <w:tcPr>
+            <w:tcW w:w="0" w:type="auto"/>
+            <w:tcBorders>
+              <w:top w:val="single" w:sz="6" w:space="0" w:color="CBD5E1"/>
+              <w:left w:val="single" w:sz="6" w:space="0" w:color="CBD5E1"/>
+              <w:bottom w:val="single" w:sz="6" w:space="0" w:color="CBD5E1"/>
+              <w:right w:val="single" w:sz="6" w:space="0" w:color="CBD5E1"/>
+            </w:tcBorders>
+            <w:tcMar>
+              <w:top w:w="120" w:type="dxa"/>
+              <w:left w:w="160" w:type="dxa"/>
+              <w:bottom w:w="120" w:type="dxa"/>
+              <w:right w:w="160" w:type="dxa"/>
+            </w:tcMar>
+            <w:hideMark/>
+          </w:tcPr>
+          <w:p>
+            <w:pPr>
+              <w:spacing w:after="280"/>
               <w:rPr>
                 <w:rFonts w:ascii="Calibri" w:eastAsia="Times New Roman" w:hAnsi="Calibri" w:cs="Calibri"/>
                 <w:color w:val="1E293B"/>
@@ -36420,7 +35515,7 @@
           </w:tcPr>
           <w:p>
             <w:pPr>
-              <w:spacing w:before="200" w:after="280"/>
+              <w:spacing w:after="280"/>
               <w:rPr>
                 <w:rFonts w:ascii="Calibri" w:eastAsia="Times New Roman" w:hAnsi="Calibri" w:cs="Calibri"/>
                 <w:color w:val="1E293B"/>
@@ -36451,26 +35546,29 @@
         </w:tc>
       </w:tr>
       <w:tr>
-        <w:tc>
-          <w:tcPr>
-            <w:tcW w:w="0" w:type="auto"/>
-            <w:tcBorders>
-              <w:top w:val="single" w:sz="6" w:space="0" w:color="CBD5E1"/>
-              <w:left w:val="single" w:sz="6" w:space="0" w:color="CBD5E1"/>
-              <w:bottom w:val="single" w:sz="6" w:space="0" w:color="CBD5E1"/>
-              <w:right w:val="single" w:sz="6" w:space="0" w:color="CBD5E1"/>
-            </w:tcBorders>
-            <w:tcMar>
-              <w:top w:w="120" w:type="dxa"/>
-              <w:left w:w="160" w:type="dxa"/>
-              <w:bottom w:w="120" w:type="dxa"/>
-              <w:right w:w="160" w:type="dxa"/>
-            </w:tcMar>
-            <w:hideMark/>
-          </w:tcPr>
-          <w:p>
-            <w:pPr>
-              <w:spacing w:before="200" w:after="280"/>
+        <w:trPr>
+          <w:trHeight w:val="725"/>
+        </w:trPr>
+        <w:tc>
+          <w:tcPr>
+            <w:tcW w:w="0" w:type="auto"/>
+            <w:tcBorders>
+              <w:top w:val="single" w:sz="6" w:space="0" w:color="CBD5E1"/>
+              <w:left w:val="single" w:sz="6" w:space="0" w:color="CBD5E1"/>
+              <w:bottom w:val="single" w:sz="6" w:space="0" w:color="CBD5E1"/>
+              <w:right w:val="single" w:sz="6" w:space="0" w:color="CBD5E1"/>
+            </w:tcBorders>
+            <w:tcMar>
+              <w:top w:w="120" w:type="dxa"/>
+              <w:left w:w="160" w:type="dxa"/>
+              <w:bottom w:w="120" w:type="dxa"/>
+              <w:right w:w="160" w:type="dxa"/>
+            </w:tcMar>
+            <w:hideMark/>
+          </w:tcPr>
+          <w:p>
+            <w:pPr>
+              <w:spacing w:after="280"/>
               <w:rPr>
                 <w:rFonts w:ascii="Calibri" w:eastAsia="Times New Roman" w:hAnsi="Calibri" w:cs="Calibri"/>
                 <w:color w:val="1E293B"/>
@@ -36509,7 +35607,7 @@
           </w:tcPr>
           <w:p>
             <w:pPr>
-              <w:spacing w:before="200" w:after="280"/>
+              <w:spacing w:after="280"/>
               <w:rPr>
                 <w:rFonts w:ascii="Calibri" w:eastAsia="Times New Roman" w:hAnsi="Calibri" w:cs="Calibri"/>
                 <w:color w:val="1E293B"/>
@@ -36540,26 +35638,29 @@
         </w:tc>
       </w:tr>
       <w:tr>
-        <w:tc>
-          <w:tcPr>
-            <w:tcW w:w="0" w:type="auto"/>
-            <w:tcBorders>
-              <w:top w:val="single" w:sz="6" w:space="0" w:color="CBD5E1"/>
-              <w:left w:val="single" w:sz="6" w:space="0" w:color="CBD5E1"/>
-              <w:bottom w:val="single" w:sz="6" w:space="0" w:color="CBD5E1"/>
-              <w:right w:val="single" w:sz="6" w:space="0" w:color="CBD5E1"/>
-            </w:tcBorders>
-            <w:tcMar>
-              <w:top w:w="120" w:type="dxa"/>
-              <w:left w:w="160" w:type="dxa"/>
-              <w:bottom w:w="120" w:type="dxa"/>
-              <w:right w:w="160" w:type="dxa"/>
-            </w:tcMar>
-            <w:hideMark/>
-          </w:tcPr>
-          <w:p>
-            <w:pPr>
-              <w:spacing w:before="200" w:after="280"/>
+        <w:trPr>
+          <w:trHeight w:val="725"/>
+        </w:trPr>
+        <w:tc>
+          <w:tcPr>
+            <w:tcW w:w="0" w:type="auto"/>
+            <w:tcBorders>
+              <w:top w:val="single" w:sz="6" w:space="0" w:color="CBD5E1"/>
+              <w:left w:val="single" w:sz="6" w:space="0" w:color="CBD5E1"/>
+              <w:bottom w:val="single" w:sz="6" w:space="0" w:color="CBD5E1"/>
+              <w:right w:val="single" w:sz="6" w:space="0" w:color="CBD5E1"/>
+            </w:tcBorders>
+            <w:tcMar>
+              <w:top w:w="120" w:type="dxa"/>
+              <w:left w:w="160" w:type="dxa"/>
+              <w:bottom w:w="120" w:type="dxa"/>
+              <w:right w:w="160" w:type="dxa"/>
+            </w:tcMar>
+            <w:hideMark/>
+          </w:tcPr>
+          <w:p>
+            <w:pPr>
+              <w:spacing w:after="280"/>
               <w:rPr>
                 <w:rFonts w:ascii="Calibri" w:eastAsia="Times New Roman" w:hAnsi="Calibri" w:cs="Calibri"/>
                 <w:color w:val="1E293B"/>
@@ -36600,7 +35701,7 @@
           </w:tcPr>
           <w:p>
             <w:pPr>
-              <w:spacing w:before="200" w:after="280"/>
+              <w:spacing w:after="280"/>
               <w:rPr>
                 <w:rFonts w:ascii="Calibri" w:eastAsia="Times New Roman" w:hAnsi="Calibri" w:cs="Calibri"/>
                 <w:color w:val="1E293B"/>
@@ -36631,26 +35732,29 @@
         </w:tc>
       </w:tr>
       <w:tr>
-        <w:tc>
-          <w:tcPr>
-            <w:tcW w:w="0" w:type="auto"/>
-            <w:tcBorders>
-              <w:top w:val="single" w:sz="6" w:space="0" w:color="CBD5E1"/>
-              <w:left w:val="single" w:sz="6" w:space="0" w:color="CBD5E1"/>
-              <w:bottom w:val="single" w:sz="6" w:space="0" w:color="CBD5E1"/>
-              <w:right w:val="single" w:sz="6" w:space="0" w:color="CBD5E1"/>
-            </w:tcBorders>
-            <w:tcMar>
-              <w:top w:w="120" w:type="dxa"/>
-              <w:left w:w="160" w:type="dxa"/>
-              <w:bottom w:w="120" w:type="dxa"/>
-              <w:right w:w="160" w:type="dxa"/>
-            </w:tcMar>
-            <w:hideMark/>
-          </w:tcPr>
-          <w:p>
-            <w:pPr>
-              <w:spacing w:before="200" w:after="280"/>
+        <w:trPr>
+          <w:trHeight w:val="725"/>
+        </w:trPr>
+        <w:tc>
+          <w:tcPr>
+            <w:tcW w:w="0" w:type="auto"/>
+            <w:tcBorders>
+              <w:top w:val="single" w:sz="6" w:space="0" w:color="CBD5E1"/>
+              <w:left w:val="single" w:sz="6" w:space="0" w:color="CBD5E1"/>
+              <w:bottom w:val="single" w:sz="6" w:space="0" w:color="CBD5E1"/>
+              <w:right w:val="single" w:sz="6" w:space="0" w:color="CBD5E1"/>
+            </w:tcBorders>
+            <w:tcMar>
+              <w:top w:w="120" w:type="dxa"/>
+              <w:left w:w="160" w:type="dxa"/>
+              <w:bottom w:w="120" w:type="dxa"/>
+              <w:right w:w="160" w:type="dxa"/>
+            </w:tcMar>
+            <w:hideMark/>
+          </w:tcPr>
+          <w:p>
+            <w:pPr>
+              <w:spacing w:after="280"/>
               <w:rPr>
                 <w:rFonts w:ascii="Calibri" w:eastAsia="Times New Roman" w:hAnsi="Calibri" w:cs="Calibri"/>
                 <w:color w:val="1E293B"/>
@@ -36689,7 +35793,7 @@
           </w:tcPr>
           <w:p>
             <w:pPr>
-              <w:spacing w:before="200" w:after="280"/>
+              <w:spacing w:after="280"/>
               <w:rPr>
                 <w:rFonts w:ascii="Calibri" w:eastAsia="Times New Roman" w:hAnsi="Calibri" w:cs="Calibri"/>
                 <w:color w:val="1E293B"/>
@@ -36720,26 +35824,29 @@
         </w:tc>
       </w:tr>
       <w:tr>
-        <w:tc>
-          <w:tcPr>
-            <w:tcW w:w="0" w:type="auto"/>
-            <w:tcBorders>
-              <w:top w:val="single" w:sz="6" w:space="0" w:color="CBD5E1"/>
-              <w:left w:val="single" w:sz="6" w:space="0" w:color="CBD5E1"/>
-              <w:bottom w:val="single" w:sz="6" w:space="0" w:color="CBD5E1"/>
-              <w:right w:val="single" w:sz="6" w:space="0" w:color="CBD5E1"/>
-            </w:tcBorders>
-            <w:tcMar>
-              <w:top w:w="120" w:type="dxa"/>
-              <w:left w:w="160" w:type="dxa"/>
-              <w:bottom w:w="120" w:type="dxa"/>
-              <w:right w:w="160" w:type="dxa"/>
-            </w:tcMar>
-            <w:hideMark/>
-          </w:tcPr>
-          <w:p>
-            <w:pPr>
-              <w:spacing w:before="200" w:after="280"/>
+        <w:trPr>
+          <w:trHeight w:val="725"/>
+        </w:trPr>
+        <w:tc>
+          <w:tcPr>
+            <w:tcW w:w="0" w:type="auto"/>
+            <w:tcBorders>
+              <w:top w:val="single" w:sz="6" w:space="0" w:color="CBD5E1"/>
+              <w:left w:val="single" w:sz="6" w:space="0" w:color="CBD5E1"/>
+              <w:bottom w:val="single" w:sz="6" w:space="0" w:color="CBD5E1"/>
+              <w:right w:val="single" w:sz="6" w:space="0" w:color="CBD5E1"/>
+            </w:tcBorders>
+            <w:tcMar>
+              <w:top w:w="120" w:type="dxa"/>
+              <w:left w:w="160" w:type="dxa"/>
+              <w:bottom w:w="120" w:type="dxa"/>
+              <w:right w:w="160" w:type="dxa"/>
+            </w:tcMar>
+            <w:hideMark/>
+          </w:tcPr>
+          <w:p>
+            <w:pPr>
+              <w:spacing w:after="280"/>
               <w:rPr>
                 <w:rFonts w:ascii="Calibri" w:eastAsia="Times New Roman" w:hAnsi="Calibri" w:cs="Calibri"/>
                 <w:color w:val="1E293B"/>
@@ -36780,7 +35887,7 @@
           </w:tcPr>
           <w:p>
             <w:pPr>
-              <w:spacing w:before="200" w:after="280"/>
+              <w:spacing w:after="280"/>
               <w:rPr>
                 <w:rFonts w:ascii="Calibri" w:eastAsia="Times New Roman" w:hAnsi="Calibri" w:cs="Calibri"/>
                 <w:color w:val="1E293B"/>
@@ -36811,26 +35918,29 @@
         </w:tc>
       </w:tr>
       <w:tr>
-        <w:tc>
-          <w:tcPr>
-            <w:tcW w:w="0" w:type="auto"/>
-            <w:tcBorders>
-              <w:top w:val="single" w:sz="6" w:space="0" w:color="CBD5E1"/>
-              <w:left w:val="single" w:sz="6" w:space="0" w:color="CBD5E1"/>
-              <w:bottom w:val="single" w:sz="6" w:space="0" w:color="CBD5E1"/>
-              <w:right w:val="single" w:sz="6" w:space="0" w:color="CBD5E1"/>
-            </w:tcBorders>
-            <w:tcMar>
-              <w:top w:w="120" w:type="dxa"/>
-              <w:left w:w="160" w:type="dxa"/>
-              <w:bottom w:w="120" w:type="dxa"/>
-              <w:right w:w="160" w:type="dxa"/>
-            </w:tcMar>
-            <w:hideMark/>
-          </w:tcPr>
-          <w:p>
-            <w:pPr>
-              <w:spacing w:before="200" w:after="280"/>
+        <w:trPr>
+          <w:trHeight w:val="714"/>
+        </w:trPr>
+        <w:tc>
+          <w:tcPr>
+            <w:tcW w:w="0" w:type="auto"/>
+            <w:tcBorders>
+              <w:top w:val="single" w:sz="6" w:space="0" w:color="CBD5E1"/>
+              <w:left w:val="single" w:sz="6" w:space="0" w:color="CBD5E1"/>
+              <w:bottom w:val="single" w:sz="6" w:space="0" w:color="CBD5E1"/>
+              <w:right w:val="single" w:sz="6" w:space="0" w:color="CBD5E1"/>
+            </w:tcBorders>
+            <w:tcMar>
+              <w:top w:w="120" w:type="dxa"/>
+              <w:left w:w="160" w:type="dxa"/>
+              <w:bottom w:w="120" w:type="dxa"/>
+              <w:right w:w="160" w:type="dxa"/>
+            </w:tcMar>
+            <w:hideMark/>
+          </w:tcPr>
+          <w:p>
+            <w:pPr>
+              <w:spacing w:after="280"/>
               <w:rPr>
                 <w:rFonts w:ascii="Calibri" w:eastAsia="Times New Roman" w:hAnsi="Calibri" w:cs="Calibri"/>
                 <w:color w:val="1E293B"/>
@@ -36846,7 +35956,6 @@
                 <w:sz w:val="19"/>
                 <w:szCs w:val="19"/>
               </w:rPr>
-              <w:lastRenderedPageBreak/>
               <w:t>RTM</w:t>
             </w:r>
           </w:p>
@@ -36870,7 +35979,7 @@
           </w:tcPr>
           <w:p>
             <w:pPr>
-              <w:spacing w:before="200" w:after="280"/>
+              <w:spacing w:after="280"/>
               <w:rPr>
                 <w:rFonts w:ascii="Calibri" w:eastAsia="Times New Roman" w:hAnsi="Calibri" w:cs="Calibri"/>
                 <w:color w:val="1E293B"/>
@@ -36901,26 +36010,29 @@
         </w:tc>
       </w:tr>
       <w:tr>
-        <w:tc>
-          <w:tcPr>
-            <w:tcW w:w="0" w:type="auto"/>
-            <w:tcBorders>
-              <w:top w:val="single" w:sz="6" w:space="0" w:color="CBD5E1"/>
-              <w:left w:val="single" w:sz="6" w:space="0" w:color="CBD5E1"/>
-              <w:bottom w:val="single" w:sz="6" w:space="0" w:color="CBD5E1"/>
-              <w:right w:val="single" w:sz="6" w:space="0" w:color="CBD5E1"/>
-            </w:tcBorders>
-            <w:tcMar>
-              <w:top w:w="120" w:type="dxa"/>
-              <w:left w:w="160" w:type="dxa"/>
-              <w:bottom w:w="120" w:type="dxa"/>
-              <w:right w:w="160" w:type="dxa"/>
-            </w:tcMar>
-            <w:hideMark/>
-          </w:tcPr>
-          <w:p>
-            <w:pPr>
-              <w:spacing w:before="200" w:after="280"/>
+        <w:trPr>
+          <w:trHeight w:val="20"/>
+        </w:trPr>
+        <w:tc>
+          <w:tcPr>
+            <w:tcW w:w="0" w:type="auto"/>
+            <w:tcBorders>
+              <w:top w:val="single" w:sz="6" w:space="0" w:color="CBD5E1"/>
+              <w:left w:val="single" w:sz="6" w:space="0" w:color="CBD5E1"/>
+              <w:bottom w:val="single" w:sz="6" w:space="0" w:color="CBD5E1"/>
+              <w:right w:val="single" w:sz="6" w:space="0" w:color="CBD5E1"/>
+            </w:tcBorders>
+            <w:tcMar>
+              <w:top w:w="120" w:type="dxa"/>
+              <w:left w:w="160" w:type="dxa"/>
+              <w:bottom w:w="120" w:type="dxa"/>
+              <w:right w:w="160" w:type="dxa"/>
+            </w:tcMar>
+            <w:hideMark/>
+          </w:tcPr>
+          <w:p>
+            <w:pPr>
+              <w:spacing w:after="280"/>
               <w:rPr>
                 <w:rFonts w:ascii="Calibri" w:eastAsia="Times New Roman" w:hAnsi="Calibri" w:cs="Calibri"/>
                 <w:color w:val="1E293B"/>
@@ -36959,7 +36071,7 @@
           </w:tcPr>
           <w:p>
             <w:pPr>
-              <w:spacing w:before="200" w:after="280"/>
+              <w:spacing w:after="280"/>
               <w:rPr>
                 <w:rFonts w:ascii="Calibri" w:eastAsia="Times New Roman" w:hAnsi="Calibri" w:cs="Calibri"/>
                 <w:color w:val="1E293B"/>
@@ -37180,6 +36292,18 @@
     </w:p>
     <w:p>
       <w:pPr>
+        <w:spacing w:before="100" w:beforeAutospacing="1" w:after="80"/>
+        <w:rPr>
+          <w:rFonts w:ascii="Calibri" w:eastAsia="Times New Roman" w:hAnsi="Calibri" w:cs="Calibri"/>
+          <w:color w:val="1E293B"/>
+          <w:sz w:val="22"/>
+          <w:szCs w:val="22"/>
+          <w:lang w:val="en"/>
+        </w:rPr>
+      </w:pPr>
+    </w:p>
+    <w:p>
+      <w:pPr>
         <w:spacing w:before="800"/>
         <w:jc w:val="center"/>
         <w:divId w:val="606738515"/>
@@ -37215,8 +36339,8 @@
       </w:r>
     </w:p>
     <w:sectPr>
-      <w:pgSz w:w="12240" w:h="15840"/>
-      <w:pgMar w:top="1440" w:right="1440" w:bottom="1440" w:left="1440" w:header="720" w:footer="720" w:gutter="0"/>
+      <w:pgSz w:w="11906" w:h="16838" w:code="9"/>
+      <w:pgMar w:top="720" w:right="720" w:bottom="720" w:left="720" w:header="720" w:footer="720" w:gutter="0"/>
       <w:cols w:space="720"/>
       <w:docGrid w:linePitch="360"/>
     </w:sectPr>

</xml_diff>